<commit_message>
react-core mfe introduced to house shared utils like useAuth hook and ProtectedRoute Component.
</commit_message>
<xml_diff>
--- a/Docs.docx
+++ b/Docs.docx
@@ -2100,23 +2100,7 @@
           <w:kern w:val="0"/>
           <w14:ligatures w14:val="none"/>
         </w:rPr>
-        <w:t xml:space="preserve">), even though they </w:t>
-      </w:r>
-      <w:r>
-        <w:rPr>
-          <w:rFonts w:ascii="Times New Roman" w:eastAsia="Times New Roman" w:hAnsi="Times New Roman" w:cs="Times New Roman"/>
-          <w:kern w:val="0"/>
-          <w14:ligatures w14:val="none"/>
-        </w:rPr>
-        <w:t>do not</w:t>
-      </w:r>
-      <w:r>
-        <w:rPr>
-          <w:rFonts w:ascii="Times New Roman" w:eastAsia="Times New Roman" w:hAnsi="Times New Roman" w:cs="Times New Roman"/>
-          <w:kern w:val="0"/>
-          <w14:ligatures w14:val="none"/>
-        </w:rPr>
-        <w:t xml:space="preserve"> render any DOM elements.</w:t>
+        <w:t>), even though they do not render any DOM elements.</w:t>
       </w:r>
     </w:p>
     <w:p>
@@ -4095,13 +4079,7 @@
         <w:t>TypeScript</w:t>
       </w:r>
       <w:r>
-        <w:t xml:space="preserve"> will yell that it cannot find a module named @comp/auth-utility (because </w:t>
-      </w:r>
-      <w:r>
-        <w:t>it is</w:t>
-      </w:r>
-      <w:r>
-        <w:t xml:space="preserve"> not in node_modules).</w:t>
+        <w:t xml:space="preserve"> will yell that it cannot find a module named @comp/auth-utility (because it is not in node_modules).</w:t>
       </w:r>
     </w:p>
     <w:p>
@@ -4119,15 +4097,7 @@
         <w:t>Vite's Bundler</w:t>
       </w:r>
       <w:r>
-        <w:t xml:space="preserve"> will fail to build because it will try to bundle that code, but it </w:t>
-      </w:r>
-      <w:proofErr w:type="gramStart"/>
-      <w:r>
-        <w:t>doesn't</w:t>
-      </w:r>
-      <w:proofErr w:type="gramEnd"/>
-      <w:r>
-        <w:t xml:space="preserve"> exist locally.</w:t>
+        <w:t xml:space="preserve"> will fail to build because it will try to bundle that code, but it doesn't exist locally.</w:t>
       </w:r>
     </w:p>
     <w:p>
@@ -4145,15 +4115,7 @@
         <w:t>Standalone Dev Mode</w:t>
       </w:r>
       <w:r>
-        <w:t xml:space="preserve"> will break because the standalone index.html </w:t>
-      </w:r>
-      <w:proofErr w:type="gramStart"/>
-      <w:r>
-        <w:t>doesn't</w:t>
-      </w:r>
-      <w:proofErr w:type="gramEnd"/>
-      <w:r>
-        <w:t xml:space="preserve"> have an import map to know where to download @comp/auth-utility from.</w:t>
+        <w:t xml:space="preserve"> will break because the standalone index.html doesn't have an import map to know where to download @comp/auth-utility from.</w:t>
       </w:r>
     </w:p>
     <w:p>
@@ -6945,20 +6907,8 @@
           <w:szCs w:val="20"/>
           <w14:ligatures w14:val="none"/>
         </w:rPr>
-        <w:t xml:space="preserve">    // 1. Subscribe to the enterprise event </w:t>
-      </w:r>
-      <w:proofErr w:type="gramStart"/>
-      <w:r>
-        <w:rPr>
-          <w:rFonts w:ascii="Courier New" w:eastAsia="Times New Roman" w:hAnsi="Courier New" w:cs="Courier New"/>
-          <w:kern w:val="0"/>
-          <w:sz w:val="20"/>
-          <w:szCs w:val="20"/>
-          <w14:ligatures w14:val="none"/>
-        </w:rPr>
-        <w:t>bus</w:t>
-      </w:r>
-      <w:proofErr w:type="gramEnd"/>
+        <w:t xml:space="preserve">    // 1. Subscribe to the enterprise event bus</w:t>
+      </w:r>
     </w:p>
     <w:p>
       <w:pPr>
@@ -7275,20 +7225,8 @@
           <w:szCs w:val="20"/>
           <w14:ligatures w14:val="none"/>
         </w:rPr>
-        <w:t xml:space="preserve">    // 2. Prevent memory leaks on </w:t>
-      </w:r>
-      <w:proofErr w:type="gramStart"/>
-      <w:r>
-        <w:rPr>
-          <w:rFonts w:ascii="Courier New" w:eastAsia="Times New Roman" w:hAnsi="Courier New" w:cs="Courier New"/>
-          <w:kern w:val="0"/>
-          <w:sz w:val="20"/>
-          <w:szCs w:val="20"/>
-          <w14:ligatures w14:val="none"/>
-        </w:rPr>
-        <w:t>unmount</w:t>
-      </w:r>
-      <w:proofErr w:type="gramEnd"/>
+        <w:t xml:space="preserve">    // 2. Prevent memory leaks on unmount</w:t>
+      </w:r>
     </w:p>
     <w:p>
       <w:pPr>
@@ -8588,13 +8526,7 @@
         <w:pStyle w:val="Heading3"/>
       </w:pPr>
       <w:r>
-        <w:t xml:space="preserve">The Architect's Breakdown: Why Vite Dev Server </w:t>
-      </w:r>
-      <w:r>
-        <w:t xml:space="preserve">Will </w:t>
-      </w:r>
-      <w:r>
-        <w:t>Crash</w:t>
+        <w:t>The Architect's Breakdown: Why Vite Dev Server Will Crash</w:t>
       </w:r>
     </w:p>
     <w:p>
@@ -8763,25 +8695,7 @@
           <w:kern w:val="0"/>
           <w14:ligatures w14:val="none"/>
         </w:rPr>
-        <w:t xml:space="preserve">. When it fails, it panics and throws a </w:t>
-      </w:r>
-      <w:proofErr w:type="gramStart"/>
-      <w:r>
-        <w:rPr>
-          <w:rFonts w:ascii="Times New Roman" w:eastAsia="Times New Roman" w:hAnsi="Times New Roman" w:cs="Times New Roman"/>
-          <w:kern w:val="0"/>
-          <w14:ligatures w14:val="none"/>
-        </w:rPr>
-        <w:t>500</w:t>
-      </w:r>
-      <w:proofErr w:type="gramEnd"/>
-      <w:r>
-        <w:rPr>
-          <w:rFonts w:ascii="Times New Roman" w:eastAsia="Times New Roman" w:hAnsi="Times New Roman" w:cs="Times New Roman"/>
-          <w:kern w:val="0"/>
-          <w14:ligatures w14:val="none"/>
-        </w:rPr>
-        <w:t xml:space="preserve"> Internal Server Error, completely interrupting the process before the browser even gets a chance to look at the standalone Import Map we provided in </w:t>
+        <w:t xml:space="preserve">. When it fails, it panics and throws a 500 Internal Server Error, completely interrupting the process before the browser even gets a chance to look at the standalone Import Map we provided in </w:t>
       </w:r>
       <w:r>
         <w:rPr>
@@ -9026,20 +8940,8 @@
           <w:szCs w:val="20"/>
           <w14:ligatures w14:val="none"/>
         </w:rPr>
-        <w:t>-plugin-externalize-</w:t>
-      </w:r>
-      <w:proofErr w:type="gramStart"/>
-      <w:r>
-        <w:rPr>
-          <w:rFonts w:ascii="Courier New" w:eastAsia="Times New Roman" w:hAnsi="Courier New" w:cs="Courier New"/>
-          <w:kern w:val="0"/>
-          <w:sz w:val="20"/>
-          <w:szCs w:val="20"/>
-          <w14:ligatures w14:val="none"/>
-        </w:rPr>
-        <w:t>dependencies</w:t>
-      </w:r>
-      <w:proofErr w:type="gramEnd"/>
+        <w:t>-plugin-externalize-dependencies</w:t>
+      </w:r>
     </w:p>
     <w:p>
       <w:pPr>
@@ -10536,13 +10438,8 @@
       </w:r>
     </w:p>
     <w:p>
-      <w:proofErr w:type="gramStart"/>
-      <w:r>
-        <w:t>Let's</w:t>
-      </w:r>
-      <w:proofErr w:type="gramEnd"/>
-      <w:r>
-        <w:t xml:space="preserve"> break down the exact architectural boundaries between these tools and why standard React Router cannot replace them at the enterprise level.</w:t>
+      <w:r>
+        <w:t>Let's break down the exact architectural boundaries between these tools and why standard React Router cannot replace them at the enterprise level.</w:t>
       </w:r>
     </w:p>
     <w:p>
@@ -10633,52 +10530,30 @@
           <w:b/>
           <w:bCs/>
         </w:rPr>
-        <w:t xml:space="preserve">What it </w:t>
-      </w:r>
-      <w:proofErr w:type="gramStart"/>
-      <w:r>
+        <w:t>What it doesn't know:</w:t>
+      </w:r>
+      <w:r>
+        <w:t xml:space="preserve"> It has absolutely no idea what React, Vue, or Angular are. It only speaks raw JavaScript promises.</w:t>
+      </w:r>
+    </w:p>
+    <w:p>
+      <w:pPr>
         <w:rPr>
           <w:b/>
           <w:bCs/>
         </w:rPr>
-        <w:t>doesn't</w:t>
-      </w:r>
-      <w:proofErr w:type="gramEnd"/>
+      </w:pPr>
       <w:r>
         <w:rPr>
           <w:b/>
           <w:bCs/>
         </w:rPr>
-        <w:t xml:space="preserve"> know:</w:t>
-      </w:r>
-      <w:r>
-        <w:t xml:space="preserve"> It has absolutely no idea what React, Vue, or Angular are. It only speaks raw JavaScript promises.</w:t>
-      </w:r>
-    </w:p>
-    <w:p>
-      <w:pPr>
-        <w:rPr>
-          <w:b/>
-          <w:bCs/>
-        </w:rPr>
-      </w:pPr>
-      <w:r>
-        <w:rPr>
-          <w:b/>
-          <w:bCs/>
-        </w:rPr>
         <w:t>2. single-spa-react (The Translator)</w:t>
       </w:r>
     </w:p>
     <w:p>
       <w:r>
-        <w:t xml:space="preserve">Because the core orchestrator </w:t>
-      </w:r>
-      <w:r>
-        <w:t>does not</w:t>
-      </w:r>
-      <w:r>
-        <w:t xml:space="preserve"> know how to render a React component, we need a translator.</w:t>
+        <w:t>Because the core orchestrator does not know how to render a React component, we need a translator.</w:t>
       </w:r>
     </w:p>
     <w:p>
@@ -10707,13 +10582,7 @@
         </w:numPr>
       </w:pPr>
       <w:r>
-        <w:t xml:space="preserve">When single-spa </w:t>
-      </w:r>
-      <w:r>
-        <w:t>says,</w:t>
-      </w:r>
-      <w:r>
-        <w:t xml:space="preserve"> "Mount this app!", single-spa-react translates that into createRoot(document.getElementById(...)).render(&lt;App /&gt;).</w:t>
+        <w:t>When single-spa says, "Mount this app!", single-spa-react translates that into createRoot(document.getElementById(...)).render(&lt;App /&gt;).</w:t>
       </w:r>
     </w:p>
     <w:p>
@@ -11037,15 +10906,7 @@
       </w:r>
       <w:proofErr w:type="spellEnd"/>
       <w:r>
-        <w:t xml:space="preserve"> because that team is </w:t>
-      </w:r>
-      <w:proofErr w:type="gramStart"/>
-      <w:r>
-        <w:t>handling</w:t>
-      </w:r>
-      <w:proofErr w:type="gramEnd"/>
-      <w:r>
-        <w:t xml:space="preserve"> their own </w:t>
+        <w:t xml:space="preserve"> because that team is handling their own </w:t>
       </w:r>
       <w:r>
         <w:rPr>
@@ -11115,13 +10976,8 @@
       </w:r>
     </w:p>
     <w:p>
-      <w:proofErr w:type="gramStart"/>
-      <w:r>
-        <w:t>Let's</w:t>
-      </w:r>
-      <w:proofErr w:type="gramEnd"/>
-      <w:r>
-        <w:t xml:space="preserve"> play out what happens if you use React Router inside the Navbar to navigate to the Dashboard:</w:t>
+      <w:r>
+        <w:t>Let's play out what happens if you use React Router inside the Navbar to navigate to the Dashboard:</w:t>
       </w:r>
     </w:p>
     <w:p>
@@ -11191,23 +11047,7 @@
         </w:numPr>
       </w:pPr>
       <w:r>
-        <w:t xml:space="preserve">Because the Navbar </w:t>
-      </w:r>
-      <w:proofErr w:type="gramStart"/>
-      <w:r>
-        <w:t>doesn't</w:t>
-      </w:r>
-      <w:proofErr w:type="gramEnd"/>
-      <w:r>
-        <w:t xml:space="preserve"> own the Dashboard UI, it </w:t>
-      </w:r>
-      <w:proofErr w:type="gramStart"/>
-      <w:r>
-        <w:t>doesn't</w:t>
-      </w:r>
-      <w:proofErr w:type="gramEnd"/>
-      <w:r>
-        <w:t xml:space="preserve"> have a &lt;Route path="/dashboard"&gt; defined.</w:t>
+        <w:t>Because the Navbar doesn't own the Dashboard UI, it doesn't have a &lt;Route path="/dashboard"&gt; defined.</w:t>
       </w:r>
     </w:p>
     <w:p>
@@ -11266,15 +11106,7 @@
         <w:t>Micro-Routing (Inside an MFE):</w:t>
       </w:r>
       <w:r>
-        <w:t xml:space="preserve"> When the Profile team wants to route from /profile/settings to /profile/security, they use React Router. That URL change is purely internal to their application, and they have &lt;Route&gt; definitions to </w:t>
-      </w:r>
-      <w:proofErr w:type="gramStart"/>
-      <w:r>
-        <w:t>handle</w:t>
-      </w:r>
-      <w:proofErr w:type="gramEnd"/>
-      <w:r>
-        <w:t xml:space="preserve"> both.</w:t>
+        <w:t xml:space="preserve"> When the Profile team wants to route from /profile/settings to /profile/security, they use React Router. That URL change is purely internal to their application, and they have &lt;Route&gt; definitions to handle both.</w:t>
       </w:r>
     </w:p>
     <w:p>
@@ -11307,15 +11139,7 @@
     </w:p>
     <w:p>
       <w:r>
-        <w:t xml:space="preserve">By using MapsToUrl, the URL changes, Single-SPA </w:t>
-      </w:r>
-      <w:proofErr w:type="gramStart"/>
-      <w:r>
-        <w:t>handles</w:t>
-      </w:r>
-      <w:proofErr w:type="gramEnd"/>
-      <w:r>
-        <w:t xml:space="preserve"> the heavy lifting, and the Navbar's internal React Router remains completely oblivious, safely preserving your navigation UI.</w:t>
+        <w:t>By using MapsToUrl, the URL changes, Single-SPA handles the heavy lifting, and the Navbar's internal React Router remains completely oblivious, safely preserving your navigation UI.</w:t>
       </w:r>
     </w:p>
     <w:p/>
@@ -11472,25 +11296,7 @@
           <w:kern w:val="0"/>
           <w14:ligatures w14:val="none"/>
         </w:rPr>
-        <w:t xml:space="preserve"> in a Microfrontend architecture introduces a massive architectural trap if not </w:t>
-      </w:r>
-      <w:proofErr w:type="gramStart"/>
-      <w:r>
-        <w:rPr>
-          <w:rFonts w:ascii="Times New Roman" w:eastAsia="Times New Roman" w:hAnsi="Times New Roman" w:cs="Times New Roman"/>
-          <w:kern w:val="0"/>
-          <w14:ligatures w14:val="none"/>
-        </w:rPr>
-        <w:t>handled</w:t>
-      </w:r>
-      <w:proofErr w:type="gramEnd"/>
-      <w:r>
-        <w:rPr>
-          <w:rFonts w:ascii="Times New Roman" w:eastAsia="Times New Roman" w:hAnsi="Times New Roman" w:cs="Times New Roman"/>
-          <w:kern w:val="0"/>
-          <w14:ligatures w14:val="none"/>
-        </w:rPr>
-        <w:t xml:space="preserve"> perfectly.</w:t>
+        <w:t xml:space="preserve"> in a Microfrontend architecture introduces a massive architectural trap if not handled perfectly.</w:t>
       </w:r>
     </w:p>
     <w:p>
@@ -12115,25 +11921,7 @@
           <w:kern w:val="0"/>
           <w14:ligatures w14:val="none"/>
         </w:rPr>
-        <w:t xml:space="preserve">When the Dashboard needs a button, they </w:t>
-      </w:r>
-      <w:proofErr w:type="gramStart"/>
-      <w:r>
-        <w:rPr>
-          <w:rFonts w:ascii="Times New Roman" w:eastAsia="Times New Roman" w:hAnsi="Times New Roman" w:cs="Times New Roman"/>
-          <w:kern w:val="0"/>
-          <w14:ligatures w14:val="none"/>
-        </w:rPr>
-        <w:t>don't</w:t>
-      </w:r>
-      <w:proofErr w:type="gramEnd"/>
-      <w:r>
-        <w:rPr>
-          <w:rFonts w:ascii="Times New Roman" w:eastAsia="Times New Roman" w:hAnsi="Times New Roman" w:cs="Times New Roman"/>
-          <w:kern w:val="0"/>
-          <w14:ligatures w14:val="none"/>
-        </w:rPr>
-        <w:t xml:space="preserve"> copy-paste code. They import it from our shared event bus, exactly like we did with the RxJS state:</w:t>
+        <w:t>When the Dashboard needs a button, they don't copy-paste code. They import it from our shared event bus, exactly like we did with the RxJS state:</w:t>
       </w:r>
     </w:p>
     <w:p>
@@ -12435,25 +12223,7 @@
           <w:kern w:val="0"/>
           <w14:ligatures w14:val="none"/>
         </w:rPr>
-        <w:t xml:space="preserve">), and every MFE in the company instantly inherits the </w:t>
-      </w:r>
-      <w:proofErr w:type="gramStart"/>
-      <w:r>
-        <w:rPr>
-          <w:rFonts w:ascii="Times New Roman" w:eastAsia="Times New Roman" w:hAnsi="Times New Roman" w:cs="Times New Roman"/>
-          <w:kern w:val="0"/>
-          <w14:ligatures w14:val="none"/>
-        </w:rPr>
-        <w:t>new look</w:t>
-      </w:r>
-      <w:proofErr w:type="gramEnd"/>
-      <w:r>
-        <w:rPr>
-          <w:rFonts w:ascii="Times New Roman" w:eastAsia="Times New Roman" w:hAnsi="Times New Roman" w:cs="Times New Roman"/>
-          <w:kern w:val="0"/>
-          <w14:ligatures w14:val="none"/>
-        </w:rPr>
-        <w:t xml:space="preserve"> without redeploying their individual apps.</w:t>
+        <w:t>), and every MFE in the company instantly inherits the new look without redeploying their individual apps.</w:t>
       </w:r>
     </w:p>
     <w:p>
@@ -13865,20 +13635,8 @@
           <w:szCs w:val="20"/>
           <w14:ligatures w14:val="none"/>
         </w:rPr>
-        <w:t xml:space="preserve">import './Dashboard.css'; // The MFE's local standard CSS </w:t>
-      </w:r>
-      <w:proofErr w:type="gramStart"/>
-      <w:r>
-        <w:rPr>
-          <w:rFonts w:ascii="Courier New" w:eastAsia="Times New Roman" w:hAnsi="Courier New" w:cs="Courier New"/>
-          <w:kern w:val="0"/>
-          <w:sz w:val="20"/>
-          <w:szCs w:val="20"/>
-          <w14:ligatures w14:val="none"/>
-        </w:rPr>
-        <w:t>file</w:t>
-      </w:r>
-      <w:proofErr w:type="gramEnd"/>
+        <w:t>import './Dashboard.css'; // The MFE's local standard CSS file</w:t>
+      </w:r>
     </w:p>
     <w:p>
       <w:pPr>
@@ -14722,12 +14480,10 @@
         <w:t xml:space="preserve"> from </w:t>
       </w:r>
       <w:proofErr w:type="spellStart"/>
-      <w:proofErr w:type="gramStart"/>
       <w:r>
         <w:t>singleSpa</w:t>
       </w:r>
       <w:proofErr w:type="spellEnd"/>
-      <w:proofErr w:type="gramEnd"/>
     </w:p>
     <w:p>
       <w:pPr>
@@ -14879,25 +14635,7 @@
           <w14:ligatures w14:val="none"/>
         </w:rPr>
         <w:lastRenderedPageBreak/>
-        <w:t xml:space="preserve">React </w:t>
-      </w:r>
-      <w:proofErr w:type="gramStart"/>
-      <w:r>
-        <w:rPr>
-          <w:rFonts w:ascii="Times New Roman" w:eastAsia="Times New Roman" w:hAnsi="Times New Roman" w:cs="Times New Roman"/>
-          <w:kern w:val="0"/>
-          <w14:ligatures w14:val="none"/>
-        </w:rPr>
-        <w:t>doesn't</w:t>
-      </w:r>
-      <w:proofErr w:type="gramEnd"/>
-      <w:r>
-        <w:rPr>
-          <w:rFonts w:ascii="Times New Roman" w:eastAsia="Times New Roman" w:hAnsi="Times New Roman" w:cs="Times New Roman"/>
-          <w:kern w:val="0"/>
-          <w14:ligatures w14:val="none"/>
-        </w:rPr>
-        <w:t xml:space="preserve"> give you native DOM events. It wraps them in its own </w:t>
+        <w:t xml:space="preserve">React doesn't give you native DOM events. It wraps them in its own </w:t>
       </w:r>
       <w:r>
         <w:rPr>
@@ -15061,304 +14799,284 @@
         </w:rPr>
         <w:t xml:space="preserve">The Enterprise-Grade Pattern: The </w:t>
       </w:r>
+      <w:r>
+        <w:rPr>
+          <w:rFonts w:ascii="Courier New" w:eastAsia="Times New Roman" w:hAnsi="Courier New" w:cs="Courier New"/>
+          <w:sz w:val="20"/>
+          <w:szCs w:val="20"/>
+        </w:rPr>
+        <w:t>MfeLink</w:t>
+      </w:r>
+      <w:r>
+        <w:rPr>
+          <w:rFonts w:eastAsia="Times New Roman"/>
+        </w:rPr>
+        <w:t xml:space="preserve"> Component</w:t>
+      </w:r>
+    </w:p>
+    <w:p>
+      <w:pPr>
+        <w:spacing w:before="100" w:beforeAutospacing="1" w:after="100" w:afterAutospacing="1" w:line="240" w:lineRule="auto"/>
+        <w:rPr>
+          <w:rFonts w:ascii="Times New Roman" w:eastAsia="Times New Roman" w:hAnsi="Times New Roman" w:cs="Times New Roman"/>
+          <w:kern w:val="0"/>
+          <w14:ligatures w14:val="none"/>
+        </w:rPr>
+      </w:pPr>
+      <w:r>
+        <w:rPr>
+          <w:rFonts w:ascii="Times New Roman" w:eastAsia="Times New Roman" w:hAnsi="Times New Roman" w:cs="Times New Roman"/>
+          <w:kern w:val="0"/>
+          <w14:ligatures w14:val="none"/>
+        </w:rPr>
+        <w:t xml:space="preserve">To make this architecture truly scalable and bulletproof, we should never write raw </w:t>
+      </w:r>
+      <w:r>
+        <w:rPr>
+          <w:rFonts w:ascii="Courier New" w:eastAsia="Times New Roman" w:hAnsi="Courier New" w:cs="Courier New"/>
+          <w:kern w:val="0"/>
+          <w:sz w:val="20"/>
+          <w:szCs w:val="20"/>
+          <w14:ligatures w14:val="none"/>
+        </w:rPr>
+        <w:t>&lt;a&gt;</w:t>
+      </w:r>
+      <w:r>
+        <w:rPr>
+          <w:rFonts w:ascii="Times New Roman" w:eastAsia="Times New Roman" w:hAnsi="Times New Roman" w:cs="Times New Roman"/>
+          <w:kern w:val="0"/>
+          <w14:ligatures w14:val="none"/>
+        </w:rPr>
+        <w:t xml:space="preserve"> tags with inline click handlers for cross-MFE routing.</w:t>
+      </w:r>
+    </w:p>
+    <w:p>
+      <w:pPr>
+        <w:spacing w:before="100" w:beforeAutospacing="1" w:after="100" w:afterAutospacing="1" w:line="240" w:lineRule="auto"/>
+        <w:rPr>
+          <w:rFonts w:ascii="Times New Roman" w:eastAsia="Times New Roman" w:hAnsi="Times New Roman" w:cs="Times New Roman"/>
+          <w:kern w:val="0"/>
+          <w14:ligatures w14:val="none"/>
+        </w:rPr>
+      </w:pPr>
+      <w:r>
+        <w:rPr>
+          <w:rFonts w:ascii="Times New Roman" w:eastAsia="Times New Roman" w:hAnsi="Times New Roman" w:cs="Times New Roman"/>
+          <w:kern w:val="0"/>
+          <w14:ligatures w14:val="none"/>
+        </w:rPr>
+        <w:t>We need to build a dedicated wrapper component that safely extracts the event, explicitly stops the browser, and then hands the URL over to Single-SPA.</w:t>
+      </w:r>
+    </w:p>
+    <w:p>
+      <w:pPr>
+        <w:spacing w:before="100" w:beforeAutospacing="1" w:after="100" w:afterAutospacing="1" w:line="240" w:lineRule="auto"/>
+        <w:rPr>
+          <w:rFonts w:ascii="Times New Roman" w:eastAsia="Times New Roman" w:hAnsi="Times New Roman" w:cs="Times New Roman"/>
+          <w:kern w:val="0"/>
+          <w14:ligatures w14:val="none"/>
+        </w:rPr>
+      </w:pPr>
+      <w:r>
+        <w:rPr>
+          <w:rFonts w:ascii="Times New Roman" w:eastAsia="Times New Roman" w:hAnsi="Times New Roman" w:cs="Times New Roman"/>
+          <w:kern w:val="0"/>
+          <w14:ligatures w14:val="none"/>
+        </w:rPr>
+        <w:t xml:space="preserve">Open </w:t>
+      </w:r>
+      <w:r>
+        <w:rPr>
+          <w:rFonts w:ascii="Courier New" w:eastAsia="Times New Roman" w:hAnsi="Courier New" w:cs="Courier New"/>
+          <w:kern w:val="0"/>
+          <w:sz w:val="20"/>
+          <w:szCs w:val="20"/>
+          <w14:ligatures w14:val="none"/>
+        </w:rPr>
+        <w:t>enterprise-navbar/src/App.tsx</w:t>
+      </w:r>
+      <w:r>
+        <w:rPr>
+          <w:rFonts w:ascii="Times New Roman" w:eastAsia="Times New Roman" w:hAnsi="Times New Roman" w:cs="Times New Roman"/>
+          <w:kern w:val="0"/>
+          <w14:ligatures w14:val="none"/>
+        </w:rPr>
+        <w:t xml:space="preserve"> and let's refactor it to use a proper routing component.</w:t>
+      </w:r>
+    </w:p>
+    <w:p>
+      <w:pPr>
+        <w:spacing w:after="0" w:line="240" w:lineRule="auto"/>
+        <w:rPr>
+          <w:rFonts w:ascii="Times New Roman" w:eastAsia="Times New Roman" w:hAnsi="Times New Roman" w:cs="Times New Roman"/>
+          <w:kern w:val="0"/>
+          <w14:ligatures w14:val="none"/>
+        </w:rPr>
+      </w:pPr>
+      <w:r>
+        <w:rPr>
+          <w:rFonts w:ascii="Times New Roman" w:eastAsia="Times New Roman" w:hAnsi="Times New Roman" w:cs="Times New Roman"/>
+          <w:kern w:val="0"/>
+          <w14:ligatures w14:val="none"/>
+        </w:rPr>
+        <w:t>TypeScript</w:t>
+      </w:r>
+    </w:p>
+    <w:p>
+      <w:pPr>
+        <w:tabs>
+          <w:tab w:val="left" w:pos="916"/>
+          <w:tab w:val="left" w:pos="1832"/>
+          <w:tab w:val="left" w:pos="2748"/>
+          <w:tab w:val="left" w:pos="3664"/>
+          <w:tab w:val="left" w:pos="4580"/>
+          <w:tab w:val="left" w:pos="5496"/>
+          <w:tab w:val="left" w:pos="6412"/>
+          <w:tab w:val="left" w:pos="7328"/>
+          <w:tab w:val="left" w:pos="8244"/>
+          <w:tab w:val="left" w:pos="9160"/>
+          <w:tab w:val="left" w:pos="10076"/>
+          <w:tab w:val="left" w:pos="10992"/>
+          <w:tab w:val="left" w:pos="11908"/>
+          <w:tab w:val="left" w:pos="12824"/>
+          <w:tab w:val="left" w:pos="13740"/>
+          <w:tab w:val="left" w:pos="14656"/>
+        </w:tabs>
+        <w:spacing w:after="0" w:line="240" w:lineRule="auto"/>
+        <w:rPr>
+          <w:rFonts w:ascii="Courier New" w:eastAsia="Times New Roman" w:hAnsi="Courier New" w:cs="Courier New"/>
+          <w:kern w:val="0"/>
+          <w:sz w:val="20"/>
+          <w:szCs w:val="20"/>
+          <w14:ligatures w14:val="none"/>
+        </w:rPr>
+      </w:pPr>
+      <w:r>
+        <w:rPr>
+          <w:rFonts w:ascii="Courier New" w:eastAsia="Times New Roman" w:hAnsi="Courier New" w:cs="Courier New"/>
+          <w:kern w:val="0"/>
+          <w:sz w:val="20"/>
+          <w:szCs w:val="20"/>
+          <w14:ligatures w14:val="none"/>
+        </w:rPr>
+        <w:t>import React, { useState, useEffect } from 'react';</w:t>
+      </w:r>
+    </w:p>
+    <w:p>
+      <w:pPr>
+        <w:tabs>
+          <w:tab w:val="left" w:pos="916"/>
+          <w:tab w:val="left" w:pos="1832"/>
+          <w:tab w:val="left" w:pos="2748"/>
+          <w:tab w:val="left" w:pos="3664"/>
+          <w:tab w:val="left" w:pos="4580"/>
+          <w:tab w:val="left" w:pos="5496"/>
+          <w:tab w:val="left" w:pos="6412"/>
+          <w:tab w:val="left" w:pos="7328"/>
+          <w:tab w:val="left" w:pos="8244"/>
+          <w:tab w:val="left" w:pos="9160"/>
+          <w:tab w:val="left" w:pos="10076"/>
+          <w:tab w:val="left" w:pos="10992"/>
+          <w:tab w:val="left" w:pos="11908"/>
+          <w:tab w:val="left" w:pos="12824"/>
+          <w:tab w:val="left" w:pos="13740"/>
+          <w:tab w:val="left" w:pos="14656"/>
+        </w:tabs>
+        <w:spacing w:after="0" w:line="240" w:lineRule="auto"/>
+        <w:rPr>
+          <w:rFonts w:ascii="Courier New" w:eastAsia="Times New Roman" w:hAnsi="Courier New" w:cs="Courier New"/>
+          <w:kern w:val="0"/>
+          <w:sz w:val="20"/>
+          <w:szCs w:val="20"/>
+          <w14:ligatures w14:val="none"/>
+        </w:rPr>
+      </w:pPr>
+      <w:r>
+        <w:rPr>
+          <w:rFonts w:ascii="Courier New" w:eastAsia="Times New Roman" w:hAnsi="Courier New" w:cs="Courier New"/>
+          <w:kern w:val="0"/>
+          <w:sz w:val="20"/>
+          <w:szCs w:val="20"/>
+          <w14:ligatures w14:val="none"/>
+        </w:rPr>
+        <w:t>import { userSession$, UserSession } from '@comp/auth-utility';</w:t>
+      </w:r>
+    </w:p>
+    <w:p>
+      <w:pPr>
+        <w:tabs>
+          <w:tab w:val="left" w:pos="916"/>
+          <w:tab w:val="left" w:pos="1832"/>
+          <w:tab w:val="left" w:pos="2748"/>
+          <w:tab w:val="left" w:pos="3664"/>
+          <w:tab w:val="left" w:pos="4580"/>
+          <w:tab w:val="left" w:pos="5496"/>
+          <w:tab w:val="left" w:pos="6412"/>
+          <w:tab w:val="left" w:pos="7328"/>
+          <w:tab w:val="left" w:pos="8244"/>
+          <w:tab w:val="left" w:pos="9160"/>
+          <w:tab w:val="left" w:pos="10076"/>
+          <w:tab w:val="left" w:pos="10992"/>
+          <w:tab w:val="left" w:pos="11908"/>
+          <w:tab w:val="left" w:pos="12824"/>
+          <w:tab w:val="left" w:pos="13740"/>
+          <w:tab w:val="left" w:pos="14656"/>
+        </w:tabs>
+        <w:spacing w:after="0" w:line="240" w:lineRule="auto"/>
+        <w:rPr>
+          <w:rFonts w:ascii="Courier New" w:eastAsia="Times New Roman" w:hAnsi="Courier New" w:cs="Courier New"/>
+          <w:kern w:val="0"/>
+          <w:sz w:val="20"/>
+          <w:szCs w:val="20"/>
+          <w14:ligatures w14:val="none"/>
+        </w:rPr>
+      </w:pPr>
+      <w:r>
+        <w:rPr>
+          <w:rFonts w:ascii="Courier New" w:eastAsia="Times New Roman" w:hAnsi="Courier New" w:cs="Courier New"/>
+          <w:kern w:val="0"/>
+          <w:sz w:val="20"/>
+          <w:szCs w:val="20"/>
+          <w14:ligatures w14:val="none"/>
+        </w:rPr>
+        <w:t xml:space="preserve">import { </w:t>
+      </w:r>
       <w:proofErr w:type="spellStart"/>
       <w:r>
         <w:rPr>
           <w:rFonts w:ascii="Courier New" w:eastAsia="Times New Roman" w:hAnsi="Courier New" w:cs="Courier New"/>
-          <w:sz w:val="20"/>
-          <w:szCs w:val="20"/>
-        </w:rPr>
-        <w:t>MfeLink</w:t>
+          <w:kern w:val="0"/>
+          <w:sz w:val="20"/>
+          <w:szCs w:val="20"/>
+          <w14:ligatures w14:val="none"/>
+        </w:rPr>
+        <w:t>navigateToUrl</w:t>
       </w:r>
       <w:proofErr w:type="spellEnd"/>
       <w:r>
         <w:rPr>
-          <w:rFonts w:eastAsia="Times New Roman"/>
-        </w:rPr>
-        <w:t xml:space="preserve"> Component</w:t>
-      </w:r>
-    </w:p>
-    <w:p>
-      <w:pPr>
-        <w:spacing w:before="100" w:beforeAutospacing="1" w:after="100" w:afterAutospacing="1" w:line="240" w:lineRule="auto"/>
-        <w:rPr>
-          <w:rFonts w:ascii="Times New Roman" w:eastAsia="Times New Roman" w:hAnsi="Times New Roman" w:cs="Times New Roman"/>
-          <w:kern w:val="0"/>
-          <w14:ligatures w14:val="none"/>
-        </w:rPr>
-      </w:pPr>
-      <w:r>
-        <w:rPr>
-          <w:rFonts w:ascii="Times New Roman" w:eastAsia="Times New Roman" w:hAnsi="Times New Roman" w:cs="Times New Roman"/>
-          <w:kern w:val="0"/>
-          <w14:ligatures w14:val="none"/>
-        </w:rPr>
-        <w:t xml:space="preserve">To make this architecture truly scalable and bulletproof, we should never write raw </w:t>
-      </w:r>
-      <w:r>
-        <w:rPr>
-          <w:rFonts w:ascii="Courier New" w:eastAsia="Times New Roman" w:hAnsi="Courier New" w:cs="Courier New"/>
-          <w:kern w:val="0"/>
-          <w:sz w:val="20"/>
-          <w:szCs w:val="20"/>
-          <w14:ligatures w14:val="none"/>
-        </w:rPr>
-        <w:t>&lt;a&gt;</w:t>
-      </w:r>
-      <w:r>
-        <w:rPr>
-          <w:rFonts w:ascii="Times New Roman" w:eastAsia="Times New Roman" w:hAnsi="Times New Roman" w:cs="Times New Roman"/>
-          <w:kern w:val="0"/>
-          <w14:ligatures w14:val="none"/>
-        </w:rPr>
-        <w:t xml:space="preserve"> tags with inline click handlers for cross-MFE routing.</w:t>
-      </w:r>
-    </w:p>
-    <w:p>
-      <w:pPr>
-        <w:spacing w:before="100" w:beforeAutospacing="1" w:after="100" w:afterAutospacing="1" w:line="240" w:lineRule="auto"/>
-        <w:rPr>
-          <w:rFonts w:ascii="Times New Roman" w:eastAsia="Times New Roman" w:hAnsi="Times New Roman" w:cs="Times New Roman"/>
-          <w:kern w:val="0"/>
-          <w14:ligatures w14:val="none"/>
-        </w:rPr>
-      </w:pPr>
-      <w:r>
-        <w:rPr>
-          <w:rFonts w:ascii="Times New Roman" w:eastAsia="Times New Roman" w:hAnsi="Times New Roman" w:cs="Times New Roman"/>
-          <w:kern w:val="0"/>
-          <w14:ligatures w14:val="none"/>
-        </w:rPr>
-        <w:t>We need to build a dedicated wrapper component that safely extracts the event, explicitly stops the browser, and then hands the URL over to Single-SPA.</w:t>
-      </w:r>
-    </w:p>
-    <w:p>
-      <w:pPr>
-        <w:spacing w:before="100" w:beforeAutospacing="1" w:after="100" w:afterAutospacing="1" w:line="240" w:lineRule="auto"/>
-        <w:rPr>
-          <w:rFonts w:ascii="Times New Roman" w:eastAsia="Times New Roman" w:hAnsi="Times New Roman" w:cs="Times New Roman"/>
-          <w:kern w:val="0"/>
-          <w14:ligatures w14:val="none"/>
-        </w:rPr>
-      </w:pPr>
-      <w:r>
-        <w:rPr>
-          <w:rFonts w:ascii="Times New Roman" w:eastAsia="Times New Roman" w:hAnsi="Times New Roman" w:cs="Times New Roman"/>
-          <w:kern w:val="0"/>
-          <w14:ligatures w14:val="none"/>
-        </w:rPr>
-        <w:t xml:space="preserve">Open </w:t>
-      </w:r>
-      <w:r>
-        <w:rPr>
-          <w:rFonts w:ascii="Courier New" w:eastAsia="Times New Roman" w:hAnsi="Courier New" w:cs="Courier New"/>
-          <w:kern w:val="0"/>
-          <w:sz w:val="20"/>
-          <w:szCs w:val="20"/>
-          <w14:ligatures w14:val="none"/>
-        </w:rPr>
-        <w:t>enterprise-navbar/src/App.tsx</w:t>
-      </w:r>
-      <w:r>
-        <w:rPr>
-          <w:rFonts w:ascii="Times New Roman" w:eastAsia="Times New Roman" w:hAnsi="Times New Roman" w:cs="Times New Roman"/>
-          <w:kern w:val="0"/>
-          <w14:ligatures w14:val="none"/>
-        </w:rPr>
-        <w:t xml:space="preserve"> and </w:t>
+          <w:rFonts w:ascii="Courier New" w:eastAsia="Times New Roman" w:hAnsi="Courier New" w:cs="Courier New"/>
+          <w:kern w:val="0"/>
+          <w:sz w:val="20"/>
+          <w:szCs w:val="20"/>
+          <w14:ligatures w14:val="none"/>
+        </w:rPr>
+        <w:t xml:space="preserve"> } from '</w:t>
       </w:r>
       <w:proofErr w:type="gramStart"/>
       <w:r>
         <w:rPr>
-          <w:rFonts w:ascii="Times New Roman" w:eastAsia="Times New Roman" w:hAnsi="Times New Roman" w:cs="Times New Roman"/>
-          <w:kern w:val="0"/>
-          <w14:ligatures w14:val="none"/>
-        </w:rPr>
-        <w:t>let's</w:t>
+          <w:rFonts w:ascii="Courier New" w:eastAsia="Times New Roman" w:hAnsi="Courier New" w:cs="Courier New"/>
+          <w:kern w:val="0"/>
+          <w:sz w:val="20"/>
+          <w:szCs w:val="20"/>
+          <w14:ligatures w14:val="none"/>
+        </w:rPr>
+        <w:t>single-spa</w:t>
       </w:r>
       <w:proofErr w:type="gramEnd"/>
       <w:r>
         <w:rPr>
-          <w:rFonts w:ascii="Times New Roman" w:eastAsia="Times New Roman" w:hAnsi="Times New Roman" w:cs="Times New Roman"/>
-          <w:kern w:val="0"/>
-          <w14:ligatures w14:val="none"/>
-        </w:rPr>
-        <w:t xml:space="preserve"> refactor it to use a proper routing component.</w:t>
-      </w:r>
-    </w:p>
-    <w:p>
-      <w:pPr>
-        <w:spacing w:after="0" w:line="240" w:lineRule="auto"/>
-        <w:rPr>
-          <w:rFonts w:ascii="Times New Roman" w:eastAsia="Times New Roman" w:hAnsi="Times New Roman" w:cs="Times New Roman"/>
-          <w:kern w:val="0"/>
-          <w14:ligatures w14:val="none"/>
-        </w:rPr>
-      </w:pPr>
-      <w:r>
-        <w:rPr>
-          <w:rFonts w:ascii="Times New Roman" w:eastAsia="Times New Roman" w:hAnsi="Times New Roman" w:cs="Times New Roman"/>
-          <w:kern w:val="0"/>
-          <w14:ligatures w14:val="none"/>
-        </w:rPr>
-        <w:t>TypeScript</w:t>
-      </w:r>
-    </w:p>
-    <w:p>
-      <w:pPr>
-        <w:tabs>
-          <w:tab w:val="left" w:pos="916"/>
-          <w:tab w:val="left" w:pos="1832"/>
-          <w:tab w:val="left" w:pos="2748"/>
-          <w:tab w:val="left" w:pos="3664"/>
-          <w:tab w:val="left" w:pos="4580"/>
-          <w:tab w:val="left" w:pos="5496"/>
-          <w:tab w:val="left" w:pos="6412"/>
-          <w:tab w:val="left" w:pos="7328"/>
-          <w:tab w:val="left" w:pos="8244"/>
-          <w:tab w:val="left" w:pos="9160"/>
-          <w:tab w:val="left" w:pos="10076"/>
-          <w:tab w:val="left" w:pos="10992"/>
-          <w:tab w:val="left" w:pos="11908"/>
-          <w:tab w:val="left" w:pos="12824"/>
-          <w:tab w:val="left" w:pos="13740"/>
-          <w:tab w:val="left" w:pos="14656"/>
-        </w:tabs>
-        <w:spacing w:after="0" w:line="240" w:lineRule="auto"/>
-        <w:rPr>
-          <w:rFonts w:ascii="Courier New" w:eastAsia="Times New Roman" w:hAnsi="Courier New" w:cs="Courier New"/>
-          <w:kern w:val="0"/>
-          <w:sz w:val="20"/>
-          <w:szCs w:val="20"/>
-          <w14:ligatures w14:val="none"/>
-        </w:rPr>
-      </w:pPr>
-      <w:r>
-        <w:rPr>
-          <w:rFonts w:ascii="Courier New" w:eastAsia="Times New Roman" w:hAnsi="Courier New" w:cs="Courier New"/>
-          <w:kern w:val="0"/>
-          <w:sz w:val="20"/>
-          <w:szCs w:val="20"/>
-          <w14:ligatures w14:val="none"/>
-        </w:rPr>
-        <w:t>import React, { useState, useEffect } from 'react';</w:t>
-      </w:r>
-    </w:p>
-    <w:p>
-      <w:pPr>
-        <w:tabs>
-          <w:tab w:val="left" w:pos="916"/>
-          <w:tab w:val="left" w:pos="1832"/>
-          <w:tab w:val="left" w:pos="2748"/>
-          <w:tab w:val="left" w:pos="3664"/>
-          <w:tab w:val="left" w:pos="4580"/>
-          <w:tab w:val="left" w:pos="5496"/>
-          <w:tab w:val="left" w:pos="6412"/>
-          <w:tab w:val="left" w:pos="7328"/>
-          <w:tab w:val="left" w:pos="8244"/>
-          <w:tab w:val="left" w:pos="9160"/>
-          <w:tab w:val="left" w:pos="10076"/>
-          <w:tab w:val="left" w:pos="10992"/>
-          <w:tab w:val="left" w:pos="11908"/>
-          <w:tab w:val="left" w:pos="12824"/>
-          <w:tab w:val="left" w:pos="13740"/>
-          <w:tab w:val="left" w:pos="14656"/>
-        </w:tabs>
-        <w:spacing w:after="0" w:line="240" w:lineRule="auto"/>
-        <w:rPr>
-          <w:rFonts w:ascii="Courier New" w:eastAsia="Times New Roman" w:hAnsi="Courier New" w:cs="Courier New"/>
-          <w:kern w:val="0"/>
-          <w:sz w:val="20"/>
-          <w:szCs w:val="20"/>
-          <w14:ligatures w14:val="none"/>
-        </w:rPr>
-      </w:pPr>
-      <w:r>
-        <w:rPr>
-          <w:rFonts w:ascii="Courier New" w:eastAsia="Times New Roman" w:hAnsi="Courier New" w:cs="Courier New"/>
-          <w:kern w:val="0"/>
-          <w:sz w:val="20"/>
-          <w:szCs w:val="20"/>
-          <w14:ligatures w14:val="none"/>
-        </w:rPr>
-        <w:t>import { userSession$, UserSession } from '@comp/auth-utility';</w:t>
-      </w:r>
-    </w:p>
-    <w:p>
-      <w:pPr>
-        <w:tabs>
-          <w:tab w:val="left" w:pos="916"/>
-          <w:tab w:val="left" w:pos="1832"/>
-          <w:tab w:val="left" w:pos="2748"/>
-          <w:tab w:val="left" w:pos="3664"/>
-          <w:tab w:val="left" w:pos="4580"/>
-          <w:tab w:val="left" w:pos="5496"/>
-          <w:tab w:val="left" w:pos="6412"/>
-          <w:tab w:val="left" w:pos="7328"/>
-          <w:tab w:val="left" w:pos="8244"/>
-          <w:tab w:val="left" w:pos="9160"/>
-          <w:tab w:val="left" w:pos="10076"/>
-          <w:tab w:val="left" w:pos="10992"/>
-          <w:tab w:val="left" w:pos="11908"/>
-          <w:tab w:val="left" w:pos="12824"/>
-          <w:tab w:val="left" w:pos="13740"/>
-          <w:tab w:val="left" w:pos="14656"/>
-        </w:tabs>
-        <w:spacing w:after="0" w:line="240" w:lineRule="auto"/>
-        <w:rPr>
-          <w:rFonts w:ascii="Courier New" w:eastAsia="Times New Roman" w:hAnsi="Courier New" w:cs="Courier New"/>
-          <w:kern w:val="0"/>
-          <w:sz w:val="20"/>
-          <w:szCs w:val="20"/>
-          <w14:ligatures w14:val="none"/>
-        </w:rPr>
-      </w:pPr>
-      <w:r>
-        <w:rPr>
-          <w:rFonts w:ascii="Courier New" w:eastAsia="Times New Roman" w:hAnsi="Courier New" w:cs="Courier New"/>
-          <w:kern w:val="0"/>
-          <w:sz w:val="20"/>
-          <w:szCs w:val="20"/>
-          <w14:ligatures w14:val="none"/>
-        </w:rPr>
-        <w:t xml:space="preserve">import { </w:t>
-      </w:r>
-      <w:proofErr w:type="spellStart"/>
-      <w:r>
-        <w:rPr>
-          <w:rFonts w:ascii="Courier New" w:eastAsia="Times New Roman" w:hAnsi="Courier New" w:cs="Courier New"/>
-          <w:kern w:val="0"/>
-          <w:sz w:val="20"/>
-          <w:szCs w:val="20"/>
-          <w14:ligatures w14:val="none"/>
-        </w:rPr>
-        <w:t>navigateToUrl</w:t>
-      </w:r>
-      <w:proofErr w:type="spellEnd"/>
-      <w:r>
-        <w:rPr>
-          <w:rFonts w:ascii="Courier New" w:eastAsia="Times New Roman" w:hAnsi="Courier New" w:cs="Courier New"/>
-          <w:kern w:val="0"/>
-          <w:sz w:val="20"/>
-          <w:szCs w:val="20"/>
-          <w14:ligatures w14:val="none"/>
-        </w:rPr>
-        <w:t xml:space="preserve"> } from '</w:t>
-      </w:r>
-      <w:proofErr w:type="gramStart"/>
-      <w:r>
-        <w:rPr>
-          <w:rFonts w:ascii="Courier New" w:eastAsia="Times New Roman" w:hAnsi="Courier New" w:cs="Courier New"/>
-          <w:kern w:val="0"/>
-          <w:sz w:val="20"/>
-          <w:szCs w:val="20"/>
-          <w14:ligatures w14:val="none"/>
-        </w:rPr>
-        <w:t>single-spa</w:t>
-      </w:r>
-      <w:proofErr w:type="gramEnd"/>
-      <w:r>
-        <w:rPr>
           <w:rFonts w:ascii="Courier New" w:eastAsia="Times New Roman" w:hAnsi="Courier New" w:cs="Courier New"/>
           <w:kern w:val="0"/>
           <w:sz w:val="20"/>
@@ -15435,81 +15153,47 @@
           <w:szCs w:val="20"/>
           <w14:ligatures w14:val="none"/>
         </w:rPr>
-        <w:t xml:space="preserve">// 1. THE ENTERPRISE FIX: Create a robust, reusable Cross-MFE Link </w:t>
-      </w:r>
-      <w:proofErr w:type="gramStart"/>
-      <w:r>
-        <w:rPr>
-          <w:rFonts w:ascii="Courier New" w:eastAsia="Times New Roman" w:hAnsi="Courier New" w:cs="Courier New"/>
-          <w:kern w:val="0"/>
-          <w:sz w:val="20"/>
-          <w:szCs w:val="20"/>
-          <w14:ligatures w14:val="none"/>
-        </w:rPr>
-        <w:t>component</w:t>
-      </w:r>
-      <w:proofErr w:type="gramEnd"/>
-    </w:p>
-    <w:p>
-      <w:pPr>
-        <w:tabs>
-          <w:tab w:val="left" w:pos="916"/>
-          <w:tab w:val="left" w:pos="1832"/>
-          <w:tab w:val="left" w:pos="2748"/>
-          <w:tab w:val="left" w:pos="3664"/>
-          <w:tab w:val="left" w:pos="4580"/>
-          <w:tab w:val="left" w:pos="5496"/>
-          <w:tab w:val="left" w:pos="6412"/>
-          <w:tab w:val="left" w:pos="7328"/>
-          <w:tab w:val="left" w:pos="8244"/>
-          <w:tab w:val="left" w:pos="9160"/>
-          <w:tab w:val="left" w:pos="10076"/>
-          <w:tab w:val="left" w:pos="10992"/>
-          <w:tab w:val="left" w:pos="11908"/>
-          <w:tab w:val="left" w:pos="12824"/>
-          <w:tab w:val="left" w:pos="13740"/>
-          <w:tab w:val="left" w:pos="14656"/>
-        </w:tabs>
-        <w:spacing w:after="0" w:line="240" w:lineRule="auto"/>
-        <w:rPr>
-          <w:rFonts w:ascii="Courier New" w:eastAsia="Times New Roman" w:hAnsi="Courier New" w:cs="Courier New"/>
-          <w:kern w:val="0"/>
-          <w:sz w:val="20"/>
-          <w:szCs w:val="20"/>
-          <w14:ligatures w14:val="none"/>
-        </w:rPr>
-      </w:pPr>
-      <w:r>
-        <w:rPr>
-          <w:rFonts w:ascii="Courier New" w:eastAsia="Times New Roman" w:hAnsi="Courier New" w:cs="Courier New"/>
-          <w:kern w:val="0"/>
-          <w:sz w:val="20"/>
-          <w:szCs w:val="20"/>
-          <w14:ligatures w14:val="none"/>
-        </w:rPr>
-        <w:t xml:space="preserve">const </w:t>
-      </w:r>
-      <w:proofErr w:type="spellStart"/>
-      <w:r>
-        <w:rPr>
-          <w:rFonts w:ascii="Courier New" w:eastAsia="Times New Roman" w:hAnsi="Courier New" w:cs="Courier New"/>
-          <w:kern w:val="0"/>
-          <w:sz w:val="20"/>
-          <w:szCs w:val="20"/>
-          <w14:ligatures w14:val="none"/>
-        </w:rPr>
-        <w:t>MfeLink</w:t>
-      </w:r>
-      <w:proofErr w:type="spellEnd"/>
-      <w:r>
-        <w:rPr>
-          <w:rFonts w:ascii="Courier New" w:eastAsia="Times New Roman" w:hAnsi="Courier New" w:cs="Courier New"/>
-          <w:kern w:val="0"/>
-          <w:sz w:val="20"/>
-          <w:szCs w:val="20"/>
-          <w14:ligatures w14:val="none"/>
-        </w:rPr>
-        <w:t xml:space="preserve"> = ({ href, children, style, </w:t>
+        <w:t>// 1. THE ENTERPRISE FIX: Create a robust, reusable Cross-MFE Link component</w:t>
+      </w:r>
+    </w:p>
+    <w:p>
+      <w:pPr>
+        <w:tabs>
+          <w:tab w:val="left" w:pos="916"/>
+          <w:tab w:val="left" w:pos="1832"/>
+          <w:tab w:val="left" w:pos="2748"/>
+          <w:tab w:val="left" w:pos="3664"/>
+          <w:tab w:val="left" w:pos="4580"/>
+          <w:tab w:val="left" w:pos="5496"/>
+          <w:tab w:val="left" w:pos="6412"/>
+          <w:tab w:val="left" w:pos="7328"/>
+          <w:tab w:val="left" w:pos="8244"/>
+          <w:tab w:val="left" w:pos="9160"/>
+          <w:tab w:val="left" w:pos="10076"/>
+          <w:tab w:val="left" w:pos="10992"/>
+          <w:tab w:val="left" w:pos="11908"/>
+          <w:tab w:val="left" w:pos="12824"/>
+          <w:tab w:val="left" w:pos="13740"/>
+          <w:tab w:val="left" w:pos="14656"/>
+        </w:tabs>
+        <w:spacing w:after="0" w:line="240" w:lineRule="auto"/>
+        <w:rPr>
+          <w:rFonts w:ascii="Courier New" w:eastAsia="Times New Roman" w:hAnsi="Courier New" w:cs="Courier New"/>
+          <w:kern w:val="0"/>
+          <w:sz w:val="20"/>
+          <w:szCs w:val="20"/>
+          <w14:ligatures w14:val="none"/>
+        </w:rPr>
+      </w:pPr>
+      <w:r>
+        <w:rPr>
+          <w:rFonts w:ascii="Courier New" w:eastAsia="Times New Roman" w:hAnsi="Courier New" w:cs="Courier New"/>
+          <w:kern w:val="0"/>
+          <w:sz w:val="20"/>
+          <w:szCs w:val="20"/>
+          <w14:ligatures w14:val="none"/>
+        </w:rPr>
+        <w:t xml:space="preserve">const MfeLink = ({ href, children, style, </w:t>
       </w:r>
       <w:proofErr w:type="spellStart"/>
       <w:r>
@@ -17282,7 +16966,47 @@
           <w:szCs w:val="20"/>
           <w14:ligatures w14:val="none"/>
         </w:rPr>
-        <w:t xml:space="preserve">      {/* 2. Replace raw anchor tags with our bulletproof </w:t>
+        <w:t xml:space="preserve">      {/* 2. Replace raw anchor tags with our bulletproof MfeLink */}</w:t>
+      </w:r>
+    </w:p>
+    <w:p>
+      <w:pPr>
+        <w:tabs>
+          <w:tab w:val="left" w:pos="916"/>
+          <w:tab w:val="left" w:pos="1832"/>
+          <w:tab w:val="left" w:pos="2748"/>
+          <w:tab w:val="left" w:pos="3664"/>
+          <w:tab w:val="left" w:pos="4580"/>
+          <w:tab w:val="left" w:pos="5496"/>
+          <w:tab w:val="left" w:pos="6412"/>
+          <w:tab w:val="left" w:pos="7328"/>
+          <w:tab w:val="left" w:pos="8244"/>
+          <w:tab w:val="left" w:pos="9160"/>
+          <w:tab w:val="left" w:pos="10076"/>
+          <w:tab w:val="left" w:pos="10992"/>
+          <w:tab w:val="left" w:pos="11908"/>
+          <w:tab w:val="left" w:pos="12824"/>
+          <w:tab w:val="left" w:pos="13740"/>
+          <w:tab w:val="left" w:pos="14656"/>
+        </w:tabs>
+        <w:spacing w:after="0" w:line="240" w:lineRule="auto"/>
+        <w:rPr>
+          <w:rFonts w:ascii="Courier New" w:eastAsia="Times New Roman" w:hAnsi="Courier New" w:cs="Courier New"/>
+          <w:kern w:val="0"/>
+          <w:sz w:val="20"/>
+          <w:szCs w:val="20"/>
+          <w14:ligatures w14:val="none"/>
+        </w:rPr>
+      </w:pPr>
+      <w:r>
+        <w:rPr>
+          <w:rFonts w:ascii="Courier New" w:eastAsia="Times New Roman" w:hAnsi="Courier New" w:cs="Courier New"/>
+          <w:kern w:val="0"/>
+          <w:sz w:val="20"/>
+          <w:szCs w:val="20"/>
+          <w14:ligatures w14:val="none"/>
+        </w:rPr>
+        <w:t xml:space="preserve">      &lt;MfeLink href="/dashboard" style={{ color: 'white', </w:t>
       </w:r>
       <w:proofErr w:type="spellStart"/>
       <w:r>
@@ -17293,7 +17017,7 @@
           <w:szCs w:val="20"/>
           <w14:ligatures w14:val="none"/>
         </w:rPr>
-        <w:t>MfeLink</w:t>
+        <w:t>textDecoration</w:t>
       </w:r>
       <w:proofErr w:type="spellEnd"/>
       <w:r>
@@ -17304,47 +17028,167 @@
           <w:szCs w:val="20"/>
           <w14:ligatures w14:val="none"/>
         </w:rPr>
-        <w:t xml:space="preserve"> */}</w:t>
-      </w:r>
-    </w:p>
-    <w:p>
-      <w:pPr>
-        <w:tabs>
-          <w:tab w:val="left" w:pos="916"/>
-          <w:tab w:val="left" w:pos="1832"/>
-          <w:tab w:val="left" w:pos="2748"/>
-          <w:tab w:val="left" w:pos="3664"/>
-          <w:tab w:val="left" w:pos="4580"/>
-          <w:tab w:val="left" w:pos="5496"/>
-          <w:tab w:val="left" w:pos="6412"/>
-          <w:tab w:val="left" w:pos="7328"/>
-          <w:tab w:val="left" w:pos="8244"/>
-          <w:tab w:val="left" w:pos="9160"/>
-          <w:tab w:val="left" w:pos="10076"/>
-          <w:tab w:val="left" w:pos="10992"/>
-          <w:tab w:val="left" w:pos="11908"/>
-          <w:tab w:val="left" w:pos="12824"/>
-          <w:tab w:val="left" w:pos="13740"/>
-          <w:tab w:val="left" w:pos="14656"/>
-        </w:tabs>
-        <w:spacing w:after="0" w:line="240" w:lineRule="auto"/>
-        <w:rPr>
-          <w:rFonts w:ascii="Courier New" w:eastAsia="Times New Roman" w:hAnsi="Courier New" w:cs="Courier New"/>
-          <w:kern w:val="0"/>
-          <w:sz w:val="20"/>
-          <w:szCs w:val="20"/>
-          <w14:ligatures w14:val="none"/>
-        </w:rPr>
-      </w:pPr>
-      <w:r>
-        <w:rPr>
-          <w:rFonts w:ascii="Courier New" w:eastAsia="Times New Roman" w:hAnsi="Courier New" w:cs="Courier New"/>
-          <w:kern w:val="0"/>
-          <w:sz w:val="20"/>
-          <w:szCs w:val="20"/>
-          <w14:ligatures w14:val="none"/>
-        </w:rPr>
-        <w:t xml:space="preserve">      &lt;</w:t>
+        <w:t>: 'none' }}&gt;</w:t>
+      </w:r>
+    </w:p>
+    <w:p>
+      <w:pPr>
+        <w:tabs>
+          <w:tab w:val="left" w:pos="916"/>
+          <w:tab w:val="left" w:pos="1832"/>
+          <w:tab w:val="left" w:pos="2748"/>
+          <w:tab w:val="left" w:pos="3664"/>
+          <w:tab w:val="left" w:pos="4580"/>
+          <w:tab w:val="left" w:pos="5496"/>
+          <w:tab w:val="left" w:pos="6412"/>
+          <w:tab w:val="left" w:pos="7328"/>
+          <w:tab w:val="left" w:pos="8244"/>
+          <w:tab w:val="left" w:pos="9160"/>
+          <w:tab w:val="left" w:pos="10076"/>
+          <w:tab w:val="left" w:pos="10992"/>
+          <w:tab w:val="left" w:pos="11908"/>
+          <w:tab w:val="left" w:pos="12824"/>
+          <w:tab w:val="left" w:pos="13740"/>
+          <w:tab w:val="left" w:pos="14656"/>
+        </w:tabs>
+        <w:spacing w:after="0" w:line="240" w:lineRule="auto"/>
+        <w:rPr>
+          <w:rFonts w:ascii="Courier New" w:eastAsia="Times New Roman" w:hAnsi="Courier New" w:cs="Courier New"/>
+          <w:kern w:val="0"/>
+          <w:sz w:val="20"/>
+          <w:szCs w:val="20"/>
+          <w14:ligatures w14:val="none"/>
+        </w:rPr>
+      </w:pPr>
+      <w:r>
+        <w:rPr>
+          <w:rFonts w:ascii="Courier New" w:eastAsia="Times New Roman" w:hAnsi="Courier New" w:cs="Courier New"/>
+          <w:kern w:val="0"/>
+          <w:sz w:val="20"/>
+          <w:szCs w:val="20"/>
+          <w14:ligatures w14:val="none"/>
+        </w:rPr>
+        <w:t xml:space="preserve">        Dashboard</w:t>
+      </w:r>
+    </w:p>
+    <w:p>
+      <w:pPr>
+        <w:tabs>
+          <w:tab w:val="left" w:pos="916"/>
+          <w:tab w:val="left" w:pos="1832"/>
+          <w:tab w:val="left" w:pos="2748"/>
+          <w:tab w:val="left" w:pos="3664"/>
+          <w:tab w:val="left" w:pos="4580"/>
+          <w:tab w:val="left" w:pos="5496"/>
+          <w:tab w:val="left" w:pos="6412"/>
+          <w:tab w:val="left" w:pos="7328"/>
+          <w:tab w:val="left" w:pos="8244"/>
+          <w:tab w:val="left" w:pos="9160"/>
+          <w:tab w:val="left" w:pos="10076"/>
+          <w:tab w:val="left" w:pos="10992"/>
+          <w:tab w:val="left" w:pos="11908"/>
+          <w:tab w:val="left" w:pos="12824"/>
+          <w:tab w:val="left" w:pos="13740"/>
+          <w:tab w:val="left" w:pos="14656"/>
+        </w:tabs>
+        <w:spacing w:after="0" w:line="240" w:lineRule="auto"/>
+        <w:rPr>
+          <w:rFonts w:ascii="Courier New" w:eastAsia="Times New Roman" w:hAnsi="Courier New" w:cs="Courier New"/>
+          <w:kern w:val="0"/>
+          <w:sz w:val="20"/>
+          <w:szCs w:val="20"/>
+          <w14:ligatures w14:val="none"/>
+        </w:rPr>
+      </w:pPr>
+      <w:r>
+        <w:rPr>
+          <w:rFonts w:ascii="Courier New" w:eastAsia="Times New Roman" w:hAnsi="Courier New" w:cs="Courier New"/>
+          <w:kern w:val="0"/>
+          <w:sz w:val="20"/>
+          <w:szCs w:val="20"/>
+          <w14:ligatures w14:val="none"/>
+        </w:rPr>
+        <w:t xml:space="preserve">      &lt;/MfeLink&gt;</w:t>
+      </w:r>
+    </w:p>
+    <w:p>
+      <w:pPr>
+        <w:tabs>
+          <w:tab w:val="left" w:pos="916"/>
+          <w:tab w:val="left" w:pos="1832"/>
+          <w:tab w:val="left" w:pos="2748"/>
+          <w:tab w:val="left" w:pos="3664"/>
+          <w:tab w:val="left" w:pos="4580"/>
+          <w:tab w:val="left" w:pos="5496"/>
+          <w:tab w:val="left" w:pos="6412"/>
+          <w:tab w:val="left" w:pos="7328"/>
+          <w:tab w:val="left" w:pos="8244"/>
+          <w:tab w:val="left" w:pos="9160"/>
+          <w:tab w:val="left" w:pos="10076"/>
+          <w:tab w:val="left" w:pos="10992"/>
+          <w:tab w:val="left" w:pos="11908"/>
+          <w:tab w:val="left" w:pos="12824"/>
+          <w:tab w:val="left" w:pos="13740"/>
+          <w:tab w:val="left" w:pos="14656"/>
+        </w:tabs>
+        <w:spacing w:after="0" w:line="240" w:lineRule="auto"/>
+        <w:rPr>
+          <w:rFonts w:ascii="Courier New" w:eastAsia="Times New Roman" w:hAnsi="Courier New" w:cs="Courier New"/>
+          <w:kern w:val="0"/>
+          <w:sz w:val="20"/>
+          <w:szCs w:val="20"/>
+          <w14:ligatures w14:val="none"/>
+        </w:rPr>
+      </w:pPr>
+      <w:r>
+        <w:rPr>
+          <w:rFonts w:ascii="Courier New" w:eastAsia="Times New Roman" w:hAnsi="Courier New" w:cs="Courier New"/>
+          <w:kern w:val="0"/>
+          <w:sz w:val="20"/>
+          <w:szCs w:val="20"/>
+          <w14:ligatures w14:val="none"/>
+        </w:rPr>
+        <w:t xml:space="preserve">      </w:t>
+      </w:r>
+    </w:p>
+    <w:p>
+      <w:pPr>
+        <w:tabs>
+          <w:tab w:val="left" w:pos="916"/>
+          <w:tab w:val="left" w:pos="1832"/>
+          <w:tab w:val="left" w:pos="2748"/>
+          <w:tab w:val="left" w:pos="3664"/>
+          <w:tab w:val="left" w:pos="4580"/>
+          <w:tab w:val="left" w:pos="5496"/>
+          <w:tab w:val="left" w:pos="6412"/>
+          <w:tab w:val="left" w:pos="7328"/>
+          <w:tab w:val="left" w:pos="8244"/>
+          <w:tab w:val="left" w:pos="9160"/>
+          <w:tab w:val="left" w:pos="10076"/>
+          <w:tab w:val="left" w:pos="10992"/>
+          <w:tab w:val="left" w:pos="11908"/>
+          <w:tab w:val="left" w:pos="12824"/>
+          <w:tab w:val="left" w:pos="13740"/>
+          <w:tab w:val="left" w:pos="14656"/>
+        </w:tabs>
+        <w:spacing w:after="0" w:line="240" w:lineRule="auto"/>
+        <w:rPr>
+          <w:rFonts w:ascii="Courier New" w:eastAsia="Times New Roman" w:hAnsi="Courier New" w:cs="Courier New"/>
+          <w:kern w:val="0"/>
+          <w:sz w:val="20"/>
+          <w:szCs w:val="20"/>
+          <w14:ligatures w14:val="none"/>
+        </w:rPr>
+      </w:pPr>
+      <w:r>
+        <w:rPr>
+          <w:rFonts w:ascii="Courier New" w:eastAsia="Times New Roman" w:hAnsi="Courier New" w:cs="Courier New"/>
+          <w:kern w:val="0"/>
+          <w:sz w:val="20"/>
+          <w:szCs w:val="20"/>
+          <w14:ligatures w14:val="none"/>
+        </w:rPr>
+        <w:t xml:space="preserve">      &lt;MfeLink href="/profile" style={{ color: 'white', </w:t>
       </w:r>
       <w:proofErr w:type="spellStart"/>
       <w:r>
@@ -17355,7 +17199,7 @@
           <w:szCs w:val="20"/>
           <w14:ligatures w14:val="none"/>
         </w:rPr>
-        <w:t>MfeLink</w:t>
+        <w:t>textDecoration</w:t>
       </w:r>
       <w:proofErr w:type="spellEnd"/>
       <w:r>
@@ -17366,7 +17210,207 @@
           <w:szCs w:val="20"/>
           <w14:ligatures w14:val="none"/>
         </w:rPr>
-        <w:t xml:space="preserve"> href="/dashboard" style={{ color: 'white', </w:t>
+        <w:t>: 'none' }}&gt;</w:t>
+      </w:r>
+    </w:p>
+    <w:p>
+      <w:pPr>
+        <w:tabs>
+          <w:tab w:val="left" w:pos="916"/>
+          <w:tab w:val="left" w:pos="1832"/>
+          <w:tab w:val="left" w:pos="2748"/>
+          <w:tab w:val="left" w:pos="3664"/>
+          <w:tab w:val="left" w:pos="4580"/>
+          <w:tab w:val="left" w:pos="5496"/>
+          <w:tab w:val="left" w:pos="6412"/>
+          <w:tab w:val="left" w:pos="7328"/>
+          <w:tab w:val="left" w:pos="8244"/>
+          <w:tab w:val="left" w:pos="9160"/>
+          <w:tab w:val="left" w:pos="10076"/>
+          <w:tab w:val="left" w:pos="10992"/>
+          <w:tab w:val="left" w:pos="11908"/>
+          <w:tab w:val="left" w:pos="12824"/>
+          <w:tab w:val="left" w:pos="13740"/>
+          <w:tab w:val="left" w:pos="14656"/>
+        </w:tabs>
+        <w:spacing w:after="0" w:line="240" w:lineRule="auto"/>
+        <w:rPr>
+          <w:rFonts w:ascii="Courier New" w:eastAsia="Times New Roman" w:hAnsi="Courier New" w:cs="Courier New"/>
+          <w:kern w:val="0"/>
+          <w:sz w:val="20"/>
+          <w:szCs w:val="20"/>
+          <w14:ligatures w14:val="none"/>
+        </w:rPr>
+      </w:pPr>
+      <w:r>
+        <w:rPr>
+          <w:rFonts w:ascii="Courier New" w:eastAsia="Times New Roman" w:hAnsi="Courier New" w:cs="Courier New"/>
+          <w:kern w:val="0"/>
+          <w:sz w:val="20"/>
+          <w:szCs w:val="20"/>
+          <w14:ligatures w14:val="none"/>
+        </w:rPr>
+        <w:t xml:space="preserve">        Profile</w:t>
+      </w:r>
+    </w:p>
+    <w:p>
+      <w:pPr>
+        <w:tabs>
+          <w:tab w:val="left" w:pos="916"/>
+          <w:tab w:val="left" w:pos="1832"/>
+          <w:tab w:val="left" w:pos="2748"/>
+          <w:tab w:val="left" w:pos="3664"/>
+          <w:tab w:val="left" w:pos="4580"/>
+          <w:tab w:val="left" w:pos="5496"/>
+          <w:tab w:val="left" w:pos="6412"/>
+          <w:tab w:val="left" w:pos="7328"/>
+          <w:tab w:val="left" w:pos="8244"/>
+          <w:tab w:val="left" w:pos="9160"/>
+          <w:tab w:val="left" w:pos="10076"/>
+          <w:tab w:val="left" w:pos="10992"/>
+          <w:tab w:val="left" w:pos="11908"/>
+          <w:tab w:val="left" w:pos="12824"/>
+          <w:tab w:val="left" w:pos="13740"/>
+          <w:tab w:val="left" w:pos="14656"/>
+        </w:tabs>
+        <w:spacing w:after="0" w:line="240" w:lineRule="auto"/>
+        <w:rPr>
+          <w:rFonts w:ascii="Courier New" w:eastAsia="Times New Roman" w:hAnsi="Courier New" w:cs="Courier New"/>
+          <w:kern w:val="0"/>
+          <w:sz w:val="20"/>
+          <w:szCs w:val="20"/>
+          <w14:ligatures w14:val="none"/>
+        </w:rPr>
+      </w:pPr>
+      <w:r>
+        <w:rPr>
+          <w:rFonts w:ascii="Courier New" w:eastAsia="Times New Roman" w:hAnsi="Courier New" w:cs="Courier New"/>
+          <w:kern w:val="0"/>
+          <w:sz w:val="20"/>
+          <w:szCs w:val="20"/>
+          <w14:ligatures w14:val="none"/>
+        </w:rPr>
+        <w:t xml:space="preserve">      &lt;/MfeLink&gt;</w:t>
+      </w:r>
+    </w:p>
+    <w:p>
+      <w:pPr>
+        <w:tabs>
+          <w:tab w:val="left" w:pos="916"/>
+          <w:tab w:val="left" w:pos="1832"/>
+          <w:tab w:val="left" w:pos="2748"/>
+          <w:tab w:val="left" w:pos="3664"/>
+          <w:tab w:val="left" w:pos="4580"/>
+          <w:tab w:val="left" w:pos="5496"/>
+          <w:tab w:val="left" w:pos="6412"/>
+          <w:tab w:val="left" w:pos="7328"/>
+          <w:tab w:val="left" w:pos="8244"/>
+          <w:tab w:val="left" w:pos="9160"/>
+          <w:tab w:val="left" w:pos="10076"/>
+          <w:tab w:val="left" w:pos="10992"/>
+          <w:tab w:val="left" w:pos="11908"/>
+          <w:tab w:val="left" w:pos="12824"/>
+          <w:tab w:val="left" w:pos="13740"/>
+          <w:tab w:val="left" w:pos="14656"/>
+        </w:tabs>
+        <w:spacing w:after="0" w:line="240" w:lineRule="auto"/>
+        <w:rPr>
+          <w:rFonts w:ascii="Courier New" w:eastAsia="Times New Roman" w:hAnsi="Courier New" w:cs="Courier New"/>
+          <w:kern w:val="0"/>
+          <w:sz w:val="20"/>
+          <w:szCs w:val="20"/>
+          <w14:ligatures w14:val="none"/>
+        </w:rPr>
+      </w:pPr>
+      <w:r>
+        <w:rPr>
+          <w:rFonts w:ascii="Courier New" w:eastAsia="Times New Roman" w:hAnsi="Courier New" w:cs="Courier New"/>
+          <w:kern w:val="0"/>
+          <w:sz w:val="20"/>
+          <w:szCs w:val="20"/>
+          <w14:ligatures w14:val="none"/>
+        </w:rPr>
+        <w:t xml:space="preserve">      </w:t>
+      </w:r>
+    </w:p>
+    <w:p>
+      <w:pPr>
+        <w:tabs>
+          <w:tab w:val="left" w:pos="916"/>
+          <w:tab w:val="left" w:pos="1832"/>
+          <w:tab w:val="left" w:pos="2748"/>
+          <w:tab w:val="left" w:pos="3664"/>
+          <w:tab w:val="left" w:pos="4580"/>
+          <w:tab w:val="left" w:pos="5496"/>
+          <w:tab w:val="left" w:pos="6412"/>
+          <w:tab w:val="left" w:pos="7328"/>
+          <w:tab w:val="left" w:pos="8244"/>
+          <w:tab w:val="left" w:pos="9160"/>
+          <w:tab w:val="left" w:pos="10076"/>
+          <w:tab w:val="left" w:pos="10992"/>
+          <w:tab w:val="left" w:pos="11908"/>
+          <w:tab w:val="left" w:pos="12824"/>
+          <w:tab w:val="left" w:pos="13740"/>
+          <w:tab w:val="left" w:pos="14656"/>
+        </w:tabs>
+        <w:spacing w:after="0" w:line="240" w:lineRule="auto"/>
+        <w:rPr>
+          <w:rFonts w:ascii="Courier New" w:eastAsia="Times New Roman" w:hAnsi="Courier New" w:cs="Courier New"/>
+          <w:kern w:val="0"/>
+          <w:sz w:val="20"/>
+          <w:szCs w:val="20"/>
+          <w14:ligatures w14:val="none"/>
+        </w:rPr>
+      </w:pPr>
+      <w:r>
+        <w:rPr>
+          <w:rFonts w:ascii="Courier New" w:eastAsia="Times New Roman" w:hAnsi="Courier New" w:cs="Courier New"/>
+          <w:kern w:val="0"/>
+          <w:sz w:val="20"/>
+          <w:szCs w:val="20"/>
+          <w14:ligatures w14:val="none"/>
+        </w:rPr>
+        <w:t xml:space="preserve">      {isAdmin &amp;&amp; (</w:t>
+      </w:r>
+    </w:p>
+    <w:p>
+      <w:pPr>
+        <w:tabs>
+          <w:tab w:val="left" w:pos="916"/>
+          <w:tab w:val="left" w:pos="1832"/>
+          <w:tab w:val="left" w:pos="2748"/>
+          <w:tab w:val="left" w:pos="3664"/>
+          <w:tab w:val="left" w:pos="4580"/>
+          <w:tab w:val="left" w:pos="5496"/>
+          <w:tab w:val="left" w:pos="6412"/>
+          <w:tab w:val="left" w:pos="7328"/>
+          <w:tab w:val="left" w:pos="8244"/>
+          <w:tab w:val="left" w:pos="9160"/>
+          <w:tab w:val="left" w:pos="10076"/>
+          <w:tab w:val="left" w:pos="10992"/>
+          <w:tab w:val="left" w:pos="11908"/>
+          <w:tab w:val="left" w:pos="12824"/>
+          <w:tab w:val="left" w:pos="13740"/>
+          <w:tab w:val="left" w:pos="14656"/>
+        </w:tabs>
+        <w:spacing w:after="0" w:line="240" w:lineRule="auto"/>
+        <w:rPr>
+          <w:rFonts w:ascii="Courier New" w:eastAsia="Times New Roman" w:hAnsi="Courier New" w:cs="Courier New"/>
+          <w:kern w:val="0"/>
+          <w:sz w:val="20"/>
+          <w:szCs w:val="20"/>
+          <w14:ligatures w14:val="none"/>
+        </w:rPr>
+      </w:pPr>
+      <w:r>
+        <w:rPr>
+          <w:rFonts w:ascii="Courier New" w:eastAsia="Times New Roman" w:hAnsi="Courier New" w:cs="Courier New"/>
+          <w:kern w:val="0"/>
+          <w:sz w:val="20"/>
+          <w:szCs w:val="20"/>
+          <w14:ligatures w14:val="none"/>
+        </w:rPr>
+        <w:t xml:space="preserve">        &lt;MfeLink href="/admin" style={{ color: '#ffb74d', </w:t>
       </w:r>
       <w:proofErr w:type="spellStart"/>
       <w:r>
@@ -17388,87 +17432,7 @@
           <w:szCs w:val="20"/>
           <w14:ligatures w14:val="none"/>
         </w:rPr>
-        <w:t>: 'none' }}&gt;</w:t>
-      </w:r>
-    </w:p>
-    <w:p>
-      <w:pPr>
-        <w:tabs>
-          <w:tab w:val="left" w:pos="916"/>
-          <w:tab w:val="left" w:pos="1832"/>
-          <w:tab w:val="left" w:pos="2748"/>
-          <w:tab w:val="left" w:pos="3664"/>
-          <w:tab w:val="left" w:pos="4580"/>
-          <w:tab w:val="left" w:pos="5496"/>
-          <w:tab w:val="left" w:pos="6412"/>
-          <w:tab w:val="left" w:pos="7328"/>
-          <w:tab w:val="left" w:pos="8244"/>
-          <w:tab w:val="left" w:pos="9160"/>
-          <w:tab w:val="left" w:pos="10076"/>
-          <w:tab w:val="left" w:pos="10992"/>
-          <w:tab w:val="left" w:pos="11908"/>
-          <w:tab w:val="left" w:pos="12824"/>
-          <w:tab w:val="left" w:pos="13740"/>
-          <w:tab w:val="left" w:pos="14656"/>
-        </w:tabs>
-        <w:spacing w:after="0" w:line="240" w:lineRule="auto"/>
-        <w:rPr>
-          <w:rFonts w:ascii="Courier New" w:eastAsia="Times New Roman" w:hAnsi="Courier New" w:cs="Courier New"/>
-          <w:kern w:val="0"/>
-          <w:sz w:val="20"/>
-          <w:szCs w:val="20"/>
-          <w14:ligatures w14:val="none"/>
-        </w:rPr>
-      </w:pPr>
-      <w:r>
-        <w:rPr>
-          <w:rFonts w:ascii="Courier New" w:eastAsia="Times New Roman" w:hAnsi="Courier New" w:cs="Courier New"/>
-          <w:kern w:val="0"/>
-          <w:sz w:val="20"/>
-          <w:szCs w:val="20"/>
-          <w14:ligatures w14:val="none"/>
-        </w:rPr>
-        <w:t xml:space="preserve">        Dashboard</w:t>
-      </w:r>
-    </w:p>
-    <w:p>
-      <w:pPr>
-        <w:tabs>
-          <w:tab w:val="left" w:pos="916"/>
-          <w:tab w:val="left" w:pos="1832"/>
-          <w:tab w:val="left" w:pos="2748"/>
-          <w:tab w:val="left" w:pos="3664"/>
-          <w:tab w:val="left" w:pos="4580"/>
-          <w:tab w:val="left" w:pos="5496"/>
-          <w:tab w:val="left" w:pos="6412"/>
-          <w:tab w:val="left" w:pos="7328"/>
-          <w:tab w:val="left" w:pos="8244"/>
-          <w:tab w:val="left" w:pos="9160"/>
-          <w:tab w:val="left" w:pos="10076"/>
-          <w:tab w:val="left" w:pos="10992"/>
-          <w:tab w:val="left" w:pos="11908"/>
-          <w:tab w:val="left" w:pos="12824"/>
-          <w:tab w:val="left" w:pos="13740"/>
-          <w:tab w:val="left" w:pos="14656"/>
-        </w:tabs>
-        <w:spacing w:after="0" w:line="240" w:lineRule="auto"/>
-        <w:rPr>
-          <w:rFonts w:ascii="Courier New" w:eastAsia="Times New Roman" w:hAnsi="Courier New" w:cs="Courier New"/>
-          <w:kern w:val="0"/>
-          <w:sz w:val="20"/>
-          <w:szCs w:val="20"/>
-          <w14:ligatures w14:val="none"/>
-        </w:rPr>
-      </w:pPr>
-      <w:r>
-        <w:rPr>
-          <w:rFonts w:ascii="Courier New" w:eastAsia="Times New Roman" w:hAnsi="Courier New" w:cs="Courier New"/>
-          <w:kern w:val="0"/>
-          <w:sz w:val="20"/>
-          <w:szCs w:val="20"/>
-          <w14:ligatures w14:val="none"/>
-        </w:rPr>
-        <w:t xml:space="preserve">      &lt;/</w:t>
+        <w:t xml:space="preserve">: 'none', border: '1px solid #ffb74d', padding: '2px 8px', </w:t>
       </w:r>
       <w:proofErr w:type="spellStart"/>
       <w:r>
@@ -17479,7 +17443,7 @@
           <w:szCs w:val="20"/>
           <w14:ligatures w14:val="none"/>
         </w:rPr>
-        <w:t>MfeLink</w:t>
+        <w:t>borderRadius</w:t>
       </w:r>
       <w:proofErr w:type="spellEnd"/>
       <w:r>
@@ -17490,418 +17454,6 @@
           <w:szCs w:val="20"/>
           <w14:ligatures w14:val="none"/>
         </w:rPr>
-        <w:t>&gt;</w:t>
-      </w:r>
-    </w:p>
-    <w:p>
-      <w:pPr>
-        <w:tabs>
-          <w:tab w:val="left" w:pos="916"/>
-          <w:tab w:val="left" w:pos="1832"/>
-          <w:tab w:val="left" w:pos="2748"/>
-          <w:tab w:val="left" w:pos="3664"/>
-          <w:tab w:val="left" w:pos="4580"/>
-          <w:tab w:val="left" w:pos="5496"/>
-          <w:tab w:val="left" w:pos="6412"/>
-          <w:tab w:val="left" w:pos="7328"/>
-          <w:tab w:val="left" w:pos="8244"/>
-          <w:tab w:val="left" w:pos="9160"/>
-          <w:tab w:val="left" w:pos="10076"/>
-          <w:tab w:val="left" w:pos="10992"/>
-          <w:tab w:val="left" w:pos="11908"/>
-          <w:tab w:val="left" w:pos="12824"/>
-          <w:tab w:val="left" w:pos="13740"/>
-          <w:tab w:val="left" w:pos="14656"/>
-        </w:tabs>
-        <w:spacing w:after="0" w:line="240" w:lineRule="auto"/>
-        <w:rPr>
-          <w:rFonts w:ascii="Courier New" w:eastAsia="Times New Roman" w:hAnsi="Courier New" w:cs="Courier New"/>
-          <w:kern w:val="0"/>
-          <w:sz w:val="20"/>
-          <w:szCs w:val="20"/>
-          <w14:ligatures w14:val="none"/>
-        </w:rPr>
-      </w:pPr>
-      <w:r>
-        <w:rPr>
-          <w:rFonts w:ascii="Courier New" w:eastAsia="Times New Roman" w:hAnsi="Courier New" w:cs="Courier New"/>
-          <w:kern w:val="0"/>
-          <w:sz w:val="20"/>
-          <w:szCs w:val="20"/>
-          <w14:ligatures w14:val="none"/>
-        </w:rPr>
-        <w:t xml:space="preserve">      </w:t>
-      </w:r>
-    </w:p>
-    <w:p>
-      <w:pPr>
-        <w:tabs>
-          <w:tab w:val="left" w:pos="916"/>
-          <w:tab w:val="left" w:pos="1832"/>
-          <w:tab w:val="left" w:pos="2748"/>
-          <w:tab w:val="left" w:pos="3664"/>
-          <w:tab w:val="left" w:pos="4580"/>
-          <w:tab w:val="left" w:pos="5496"/>
-          <w:tab w:val="left" w:pos="6412"/>
-          <w:tab w:val="left" w:pos="7328"/>
-          <w:tab w:val="left" w:pos="8244"/>
-          <w:tab w:val="left" w:pos="9160"/>
-          <w:tab w:val="left" w:pos="10076"/>
-          <w:tab w:val="left" w:pos="10992"/>
-          <w:tab w:val="left" w:pos="11908"/>
-          <w:tab w:val="left" w:pos="12824"/>
-          <w:tab w:val="left" w:pos="13740"/>
-          <w:tab w:val="left" w:pos="14656"/>
-        </w:tabs>
-        <w:spacing w:after="0" w:line="240" w:lineRule="auto"/>
-        <w:rPr>
-          <w:rFonts w:ascii="Courier New" w:eastAsia="Times New Roman" w:hAnsi="Courier New" w:cs="Courier New"/>
-          <w:kern w:val="0"/>
-          <w:sz w:val="20"/>
-          <w:szCs w:val="20"/>
-          <w14:ligatures w14:val="none"/>
-        </w:rPr>
-      </w:pPr>
-      <w:r>
-        <w:rPr>
-          <w:rFonts w:ascii="Courier New" w:eastAsia="Times New Roman" w:hAnsi="Courier New" w:cs="Courier New"/>
-          <w:kern w:val="0"/>
-          <w:sz w:val="20"/>
-          <w:szCs w:val="20"/>
-          <w14:ligatures w14:val="none"/>
-        </w:rPr>
-        <w:t xml:space="preserve">      &lt;</w:t>
-      </w:r>
-      <w:proofErr w:type="spellStart"/>
-      <w:r>
-        <w:rPr>
-          <w:rFonts w:ascii="Courier New" w:eastAsia="Times New Roman" w:hAnsi="Courier New" w:cs="Courier New"/>
-          <w:kern w:val="0"/>
-          <w:sz w:val="20"/>
-          <w:szCs w:val="20"/>
-          <w14:ligatures w14:val="none"/>
-        </w:rPr>
-        <w:t>MfeLink</w:t>
-      </w:r>
-      <w:proofErr w:type="spellEnd"/>
-      <w:r>
-        <w:rPr>
-          <w:rFonts w:ascii="Courier New" w:eastAsia="Times New Roman" w:hAnsi="Courier New" w:cs="Courier New"/>
-          <w:kern w:val="0"/>
-          <w:sz w:val="20"/>
-          <w:szCs w:val="20"/>
-          <w14:ligatures w14:val="none"/>
-        </w:rPr>
-        <w:t xml:space="preserve"> href="/profile" style={{ color: 'white', </w:t>
-      </w:r>
-      <w:proofErr w:type="spellStart"/>
-      <w:r>
-        <w:rPr>
-          <w:rFonts w:ascii="Courier New" w:eastAsia="Times New Roman" w:hAnsi="Courier New" w:cs="Courier New"/>
-          <w:kern w:val="0"/>
-          <w:sz w:val="20"/>
-          <w:szCs w:val="20"/>
-          <w14:ligatures w14:val="none"/>
-        </w:rPr>
-        <w:t>textDecoration</w:t>
-      </w:r>
-      <w:proofErr w:type="spellEnd"/>
-      <w:r>
-        <w:rPr>
-          <w:rFonts w:ascii="Courier New" w:eastAsia="Times New Roman" w:hAnsi="Courier New" w:cs="Courier New"/>
-          <w:kern w:val="0"/>
-          <w:sz w:val="20"/>
-          <w:szCs w:val="20"/>
-          <w14:ligatures w14:val="none"/>
-        </w:rPr>
-        <w:t>: 'none' }}&gt;</w:t>
-      </w:r>
-    </w:p>
-    <w:p>
-      <w:pPr>
-        <w:tabs>
-          <w:tab w:val="left" w:pos="916"/>
-          <w:tab w:val="left" w:pos="1832"/>
-          <w:tab w:val="left" w:pos="2748"/>
-          <w:tab w:val="left" w:pos="3664"/>
-          <w:tab w:val="left" w:pos="4580"/>
-          <w:tab w:val="left" w:pos="5496"/>
-          <w:tab w:val="left" w:pos="6412"/>
-          <w:tab w:val="left" w:pos="7328"/>
-          <w:tab w:val="left" w:pos="8244"/>
-          <w:tab w:val="left" w:pos="9160"/>
-          <w:tab w:val="left" w:pos="10076"/>
-          <w:tab w:val="left" w:pos="10992"/>
-          <w:tab w:val="left" w:pos="11908"/>
-          <w:tab w:val="left" w:pos="12824"/>
-          <w:tab w:val="left" w:pos="13740"/>
-          <w:tab w:val="left" w:pos="14656"/>
-        </w:tabs>
-        <w:spacing w:after="0" w:line="240" w:lineRule="auto"/>
-        <w:rPr>
-          <w:rFonts w:ascii="Courier New" w:eastAsia="Times New Roman" w:hAnsi="Courier New" w:cs="Courier New"/>
-          <w:kern w:val="0"/>
-          <w:sz w:val="20"/>
-          <w:szCs w:val="20"/>
-          <w14:ligatures w14:val="none"/>
-        </w:rPr>
-      </w:pPr>
-      <w:r>
-        <w:rPr>
-          <w:rFonts w:ascii="Courier New" w:eastAsia="Times New Roman" w:hAnsi="Courier New" w:cs="Courier New"/>
-          <w:kern w:val="0"/>
-          <w:sz w:val="20"/>
-          <w:szCs w:val="20"/>
-          <w14:ligatures w14:val="none"/>
-        </w:rPr>
-        <w:t xml:space="preserve">        Profile</w:t>
-      </w:r>
-    </w:p>
-    <w:p>
-      <w:pPr>
-        <w:tabs>
-          <w:tab w:val="left" w:pos="916"/>
-          <w:tab w:val="left" w:pos="1832"/>
-          <w:tab w:val="left" w:pos="2748"/>
-          <w:tab w:val="left" w:pos="3664"/>
-          <w:tab w:val="left" w:pos="4580"/>
-          <w:tab w:val="left" w:pos="5496"/>
-          <w:tab w:val="left" w:pos="6412"/>
-          <w:tab w:val="left" w:pos="7328"/>
-          <w:tab w:val="left" w:pos="8244"/>
-          <w:tab w:val="left" w:pos="9160"/>
-          <w:tab w:val="left" w:pos="10076"/>
-          <w:tab w:val="left" w:pos="10992"/>
-          <w:tab w:val="left" w:pos="11908"/>
-          <w:tab w:val="left" w:pos="12824"/>
-          <w:tab w:val="left" w:pos="13740"/>
-          <w:tab w:val="left" w:pos="14656"/>
-        </w:tabs>
-        <w:spacing w:after="0" w:line="240" w:lineRule="auto"/>
-        <w:rPr>
-          <w:rFonts w:ascii="Courier New" w:eastAsia="Times New Roman" w:hAnsi="Courier New" w:cs="Courier New"/>
-          <w:kern w:val="0"/>
-          <w:sz w:val="20"/>
-          <w:szCs w:val="20"/>
-          <w14:ligatures w14:val="none"/>
-        </w:rPr>
-      </w:pPr>
-      <w:r>
-        <w:rPr>
-          <w:rFonts w:ascii="Courier New" w:eastAsia="Times New Roman" w:hAnsi="Courier New" w:cs="Courier New"/>
-          <w:kern w:val="0"/>
-          <w:sz w:val="20"/>
-          <w:szCs w:val="20"/>
-          <w14:ligatures w14:val="none"/>
-        </w:rPr>
-        <w:t xml:space="preserve">      &lt;/</w:t>
-      </w:r>
-      <w:proofErr w:type="spellStart"/>
-      <w:r>
-        <w:rPr>
-          <w:rFonts w:ascii="Courier New" w:eastAsia="Times New Roman" w:hAnsi="Courier New" w:cs="Courier New"/>
-          <w:kern w:val="0"/>
-          <w:sz w:val="20"/>
-          <w:szCs w:val="20"/>
-          <w14:ligatures w14:val="none"/>
-        </w:rPr>
-        <w:t>MfeLink</w:t>
-      </w:r>
-      <w:proofErr w:type="spellEnd"/>
-      <w:r>
-        <w:rPr>
-          <w:rFonts w:ascii="Courier New" w:eastAsia="Times New Roman" w:hAnsi="Courier New" w:cs="Courier New"/>
-          <w:kern w:val="0"/>
-          <w:sz w:val="20"/>
-          <w:szCs w:val="20"/>
-          <w14:ligatures w14:val="none"/>
-        </w:rPr>
-        <w:t>&gt;</w:t>
-      </w:r>
-    </w:p>
-    <w:p>
-      <w:pPr>
-        <w:tabs>
-          <w:tab w:val="left" w:pos="916"/>
-          <w:tab w:val="left" w:pos="1832"/>
-          <w:tab w:val="left" w:pos="2748"/>
-          <w:tab w:val="left" w:pos="3664"/>
-          <w:tab w:val="left" w:pos="4580"/>
-          <w:tab w:val="left" w:pos="5496"/>
-          <w:tab w:val="left" w:pos="6412"/>
-          <w:tab w:val="left" w:pos="7328"/>
-          <w:tab w:val="left" w:pos="8244"/>
-          <w:tab w:val="left" w:pos="9160"/>
-          <w:tab w:val="left" w:pos="10076"/>
-          <w:tab w:val="left" w:pos="10992"/>
-          <w:tab w:val="left" w:pos="11908"/>
-          <w:tab w:val="left" w:pos="12824"/>
-          <w:tab w:val="left" w:pos="13740"/>
-          <w:tab w:val="left" w:pos="14656"/>
-        </w:tabs>
-        <w:spacing w:after="0" w:line="240" w:lineRule="auto"/>
-        <w:rPr>
-          <w:rFonts w:ascii="Courier New" w:eastAsia="Times New Roman" w:hAnsi="Courier New" w:cs="Courier New"/>
-          <w:kern w:val="0"/>
-          <w:sz w:val="20"/>
-          <w:szCs w:val="20"/>
-          <w14:ligatures w14:val="none"/>
-        </w:rPr>
-      </w:pPr>
-      <w:r>
-        <w:rPr>
-          <w:rFonts w:ascii="Courier New" w:eastAsia="Times New Roman" w:hAnsi="Courier New" w:cs="Courier New"/>
-          <w:kern w:val="0"/>
-          <w:sz w:val="20"/>
-          <w:szCs w:val="20"/>
-          <w14:ligatures w14:val="none"/>
-        </w:rPr>
-        <w:t xml:space="preserve">      </w:t>
-      </w:r>
-    </w:p>
-    <w:p>
-      <w:pPr>
-        <w:tabs>
-          <w:tab w:val="left" w:pos="916"/>
-          <w:tab w:val="left" w:pos="1832"/>
-          <w:tab w:val="left" w:pos="2748"/>
-          <w:tab w:val="left" w:pos="3664"/>
-          <w:tab w:val="left" w:pos="4580"/>
-          <w:tab w:val="left" w:pos="5496"/>
-          <w:tab w:val="left" w:pos="6412"/>
-          <w:tab w:val="left" w:pos="7328"/>
-          <w:tab w:val="left" w:pos="8244"/>
-          <w:tab w:val="left" w:pos="9160"/>
-          <w:tab w:val="left" w:pos="10076"/>
-          <w:tab w:val="left" w:pos="10992"/>
-          <w:tab w:val="left" w:pos="11908"/>
-          <w:tab w:val="left" w:pos="12824"/>
-          <w:tab w:val="left" w:pos="13740"/>
-          <w:tab w:val="left" w:pos="14656"/>
-        </w:tabs>
-        <w:spacing w:after="0" w:line="240" w:lineRule="auto"/>
-        <w:rPr>
-          <w:rFonts w:ascii="Courier New" w:eastAsia="Times New Roman" w:hAnsi="Courier New" w:cs="Courier New"/>
-          <w:kern w:val="0"/>
-          <w:sz w:val="20"/>
-          <w:szCs w:val="20"/>
-          <w14:ligatures w14:val="none"/>
-        </w:rPr>
-      </w:pPr>
-      <w:r>
-        <w:rPr>
-          <w:rFonts w:ascii="Courier New" w:eastAsia="Times New Roman" w:hAnsi="Courier New" w:cs="Courier New"/>
-          <w:kern w:val="0"/>
-          <w:sz w:val="20"/>
-          <w:szCs w:val="20"/>
-          <w14:ligatures w14:val="none"/>
-        </w:rPr>
-        <w:t xml:space="preserve">      {isAdmin &amp;&amp; (</w:t>
-      </w:r>
-    </w:p>
-    <w:p>
-      <w:pPr>
-        <w:tabs>
-          <w:tab w:val="left" w:pos="916"/>
-          <w:tab w:val="left" w:pos="1832"/>
-          <w:tab w:val="left" w:pos="2748"/>
-          <w:tab w:val="left" w:pos="3664"/>
-          <w:tab w:val="left" w:pos="4580"/>
-          <w:tab w:val="left" w:pos="5496"/>
-          <w:tab w:val="left" w:pos="6412"/>
-          <w:tab w:val="left" w:pos="7328"/>
-          <w:tab w:val="left" w:pos="8244"/>
-          <w:tab w:val="left" w:pos="9160"/>
-          <w:tab w:val="left" w:pos="10076"/>
-          <w:tab w:val="left" w:pos="10992"/>
-          <w:tab w:val="left" w:pos="11908"/>
-          <w:tab w:val="left" w:pos="12824"/>
-          <w:tab w:val="left" w:pos="13740"/>
-          <w:tab w:val="left" w:pos="14656"/>
-        </w:tabs>
-        <w:spacing w:after="0" w:line="240" w:lineRule="auto"/>
-        <w:rPr>
-          <w:rFonts w:ascii="Courier New" w:eastAsia="Times New Roman" w:hAnsi="Courier New" w:cs="Courier New"/>
-          <w:kern w:val="0"/>
-          <w:sz w:val="20"/>
-          <w:szCs w:val="20"/>
-          <w14:ligatures w14:val="none"/>
-        </w:rPr>
-      </w:pPr>
-      <w:r>
-        <w:rPr>
-          <w:rFonts w:ascii="Courier New" w:eastAsia="Times New Roman" w:hAnsi="Courier New" w:cs="Courier New"/>
-          <w:kern w:val="0"/>
-          <w:sz w:val="20"/>
-          <w:szCs w:val="20"/>
-          <w14:ligatures w14:val="none"/>
-        </w:rPr>
-        <w:t xml:space="preserve">        &lt;</w:t>
-      </w:r>
-      <w:proofErr w:type="spellStart"/>
-      <w:r>
-        <w:rPr>
-          <w:rFonts w:ascii="Courier New" w:eastAsia="Times New Roman" w:hAnsi="Courier New" w:cs="Courier New"/>
-          <w:kern w:val="0"/>
-          <w:sz w:val="20"/>
-          <w:szCs w:val="20"/>
-          <w14:ligatures w14:val="none"/>
-        </w:rPr>
-        <w:t>MfeLink</w:t>
-      </w:r>
-      <w:proofErr w:type="spellEnd"/>
-      <w:r>
-        <w:rPr>
-          <w:rFonts w:ascii="Courier New" w:eastAsia="Times New Roman" w:hAnsi="Courier New" w:cs="Courier New"/>
-          <w:kern w:val="0"/>
-          <w:sz w:val="20"/>
-          <w:szCs w:val="20"/>
-          <w14:ligatures w14:val="none"/>
-        </w:rPr>
-        <w:t xml:space="preserve"> href="/admin" style={{ color: '#ffb74d', </w:t>
-      </w:r>
-      <w:proofErr w:type="spellStart"/>
-      <w:r>
-        <w:rPr>
-          <w:rFonts w:ascii="Courier New" w:eastAsia="Times New Roman" w:hAnsi="Courier New" w:cs="Courier New"/>
-          <w:kern w:val="0"/>
-          <w:sz w:val="20"/>
-          <w:szCs w:val="20"/>
-          <w14:ligatures w14:val="none"/>
-        </w:rPr>
-        <w:t>textDecoration</w:t>
-      </w:r>
-      <w:proofErr w:type="spellEnd"/>
-      <w:r>
-        <w:rPr>
-          <w:rFonts w:ascii="Courier New" w:eastAsia="Times New Roman" w:hAnsi="Courier New" w:cs="Courier New"/>
-          <w:kern w:val="0"/>
-          <w:sz w:val="20"/>
-          <w:szCs w:val="20"/>
-          <w14:ligatures w14:val="none"/>
-        </w:rPr>
-        <w:t xml:space="preserve">: 'none', border: '1px solid #ffb74d', padding: '2px 8px', </w:t>
-      </w:r>
-      <w:proofErr w:type="spellStart"/>
-      <w:r>
-        <w:rPr>
-          <w:rFonts w:ascii="Courier New" w:eastAsia="Times New Roman" w:hAnsi="Courier New" w:cs="Courier New"/>
-          <w:kern w:val="0"/>
-          <w:sz w:val="20"/>
-          <w:szCs w:val="20"/>
-          <w14:ligatures w14:val="none"/>
-        </w:rPr>
-        <w:t>borderRadius</w:t>
-      </w:r>
-      <w:proofErr w:type="spellEnd"/>
-      <w:r>
-        <w:rPr>
-          <w:rFonts w:ascii="Courier New" w:eastAsia="Times New Roman" w:hAnsi="Courier New" w:cs="Courier New"/>
-          <w:kern w:val="0"/>
-          <w:sz w:val="20"/>
-          <w:szCs w:val="20"/>
-          <w14:ligatures w14:val="none"/>
-        </w:rPr>
         <w:t>: '4px' }}&gt;</w:t>
       </w:r>
     </w:p>
@@ -17982,29 +17534,7 @@
           <w:szCs w:val="20"/>
           <w14:ligatures w14:val="none"/>
         </w:rPr>
-        <w:t xml:space="preserve">        &lt;/</w:t>
-      </w:r>
-      <w:proofErr w:type="spellStart"/>
-      <w:r>
-        <w:rPr>
-          <w:rFonts w:ascii="Courier New" w:eastAsia="Times New Roman" w:hAnsi="Courier New" w:cs="Courier New"/>
-          <w:kern w:val="0"/>
-          <w:sz w:val="20"/>
-          <w:szCs w:val="20"/>
-          <w14:ligatures w14:val="none"/>
-        </w:rPr>
-        <w:t>MfeLink</w:t>
-      </w:r>
-      <w:proofErr w:type="spellEnd"/>
-      <w:r>
-        <w:rPr>
-          <w:rFonts w:ascii="Courier New" w:eastAsia="Times New Roman" w:hAnsi="Courier New" w:cs="Courier New"/>
-          <w:kern w:val="0"/>
-          <w:sz w:val="20"/>
-          <w:szCs w:val="20"/>
-          <w14:ligatures w14:val="none"/>
-        </w:rPr>
-        <w:t>&gt;</w:t>
+        <w:t xml:space="preserve">        &lt;/MfeLink&gt;</w:t>
       </w:r>
     </w:p>
     <w:p>
@@ -18572,7 +18102,6 @@
         </w:rPr>
         <w:t xml:space="preserve"> logic inside the </w:t>
       </w:r>
-      <w:proofErr w:type="spellStart"/>
       <w:r>
         <w:rPr>
           <w:rFonts w:ascii="Courier New" w:eastAsia="Times New Roman" w:hAnsi="Courier New" w:cs="Courier New"/>
@@ -18583,7 +18112,6 @@
         </w:rPr>
         <w:t>MfeLink</w:t>
       </w:r>
-      <w:proofErr w:type="spellEnd"/>
       <w:r>
         <w:rPr>
           <w:rFonts w:ascii="Times New Roman" w:eastAsia="Times New Roman" w:hAnsi="Times New Roman" w:cs="Times New Roman"/>
@@ -18707,6 +18235,503 @@
           <w14:ligatures w14:val="none"/>
         </w:rPr>
         <w:t xml:space="preserve"> the framework-agnostic orchestrator takes over.</w:t>
+      </w:r>
+    </w:p>
+    <w:p>
+      <w:pPr>
+        <w:pStyle w:val="Heading2"/>
+      </w:pPr>
+      <w:r>
+        <w:t>Security &amp; Routing Boundaries</w:t>
+      </w:r>
+    </w:p>
+    <w:p>
+      <w:pPr>
+        <w:pStyle w:val="Heading3"/>
+      </w:pPr>
+      <w:r>
+        <w:t>What We Decided</w:t>
+      </w:r>
+    </w:p>
+    <w:p>
+      <w:pPr>
+        <w:pStyle w:val="NormalWeb"/>
+      </w:pPr>
+      <w:r>
+        <w:t xml:space="preserve">We implemented a strict separation between </w:t>
+      </w:r>
+      <w:r>
+        <w:rPr>
+          <w:b/>
+          <w:bCs/>
+        </w:rPr>
+        <w:t>Macro-Routing</w:t>
+      </w:r>
+      <w:r>
+        <w:t xml:space="preserve"> (moving between MFEs) and </w:t>
+      </w:r>
+      <w:r>
+        <w:rPr>
+          <w:b/>
+          <w:bCs/>
+        </w:rPr>
+        <w:t>Micro-Routing</w:t>
+      </w:r>
+      <w:r>
+        <w:t xml:space="preserve"> (moving within an MFE). We also introduced a dedicated React adapter library (</w:t>
+      </w:r>
+      <w:r>
+        <w:rPr>
+          <w:rStyle w:val="HTMLCode"/>
+          <w:rFonts w:eastAsiaTheme="majorEastAsia"/>
+        </w:rPr>
+        <w:t>@comp/react-core</w:t>
+      </w:r>
+      <w:r>
+        <w:t>) to house our Route Guards.</w:t>
+      </w:r>
+    </w:p>
+    <w:p>
+      <w:pPr>
+        <w:pStyle w:val="Heading3"/>
+      </w:pPr>
+      <w:r>
+        <w:lastRenderedPageBreak/>
+        <w:t>Why We Chose It</w:t>
+      </w:r>
+    </w:p>
+    <w:p>
+      <w:pPr>
+        <w:pStyle w:val="NormalWeb"/>
+        <w:numPr>
+          <w:ilvl w:val="0"/>
+          <w:numId w:val="16"/>
+        </w:numPr>
+      </w:pPr>
+      <w:r>
+        <w:rPr>
+          <w:b/>
+          <w:bCs/>
+        </w:rPr>
+        <w:t>Preventing Router Conflicts:</w:t>
+      </w:r>
+      <w:r>
+        <w:t xml:space="preserve"> We strictly forbid using React Router for cross-MFE navigation, as it causes "404 Not Found" collisions when two independent React trees attempt to parse the same URL. We mandate Single-SPA's </w:t>
+      </w:r>
+      <w:r>
+        <w:rPr>
+          <w:rStyle w:val="HTMLCode"/>
+          <w:rFonts w:eastAsiaTheme="majorEastAsia"/>
+        </w:rPr>
+        <w:t>MapsToUrl</w:t>
+      </w:r>
+      <w:r>
+        <w:t xml:space="preserve"> (via a custom </w:t>
+      </w:r>
+      <w:r>
+        <w:rPr>
+          <w:rStyle w:val="HTMLCode"/>
+          <w:rFonts w:eastAsiaTheme="majorEastAsia"/>
+        </w:rPr>
+        <w:t>MfeLink</w:t>
+      </w:r>
+      <w:r>
+        <w:t xml:space="preserve"> component) to safely swap DOM layouts.</w:t>
+      </w:r>
+    </w:p>
+    <w:p>
+      <w:pPr>
+        <w:pStyle w:val="NormalWeb"/>
+        <w:numPr>
+          <w:ilvl w:val="0"/>
+          <w:numId w:val="16"/>
+        </w:numPr>
+      </w:pPr>
+      <w:r>
+        <w:rPr>
+          <w:b/>
+          <w:bCs/>
+        </w:rPr>
+        <w:t>The Route Guard Wrapper:</w:t>
+      </w:r>
+      <w:r>
+        <w:t xml:space="preserve"> Conditional UI rendering (</w:t>
+      </w:r>
+      <w:r>
+        <w:rPr>
+          <w:rStyle w:val="HTMLCode"/>
+          <w:rFonts w:eastAsiaTheme="majorEastAsia"/>
+        </w:rPr>
+        <w:t>if (!auth) return null</w:t>
+      </w:r>
+      <w:r>
+        <w:t>) is a security risk as it allows unauthorized components to briefly mount and execute background hooks. We enforce a Higher-Order Wrapper (</w:t>
+      </w:r>
+      <w:r>
+        <w:rPr>
+          <w:rStyle w:val="HTMLCode"/>
+          <w:rFonts w:eastAsiaTheme="majorEastAsia"/>
+        </w:rPr>
+        <w:t>&lt;ProtectedRoute&gt;</w:t>
+      </w:r>
+      <w:r>
+        <w:t>) that physically intercepts the render cycle and aggressively reroutes unauthorized users, ensuring strict compliance and data protection.</w:t>
+      </w:r>
+    </w:p>
+    <w:p>
+      <w:pPr>
+        <w:pStyle w:val="NormalWeb"/>
+        <w:numPr>
+          <w:ilvl w:val="0"/>
+          <w:numId w:val="16"/>
+        </w:numPr>
+      </w:pPr>
+      <w:r>
+        <w:rPr>
+          <w:b/>
+          <w:bCs/>
+        </w:rPr>
+        <w:t>The Adapter Pattern (DRY):</w:t>
+      </w:r>
+      <w:r>
+        <w:t xml:space="preserve"> By placing the React-specific Custom Hooks and Route Guards in </w:t>
+      </w:r>
+      <w:r>
+        <w:rPr>
+          <w:rStyle w:val="HTMLCode"/>
+          <w:rFonts w:eastAsiaTheme="majorEastAsia"/>
+        </w:rPr>
+        <w:t>@comp/react-core</w:t>
+      </w:r>
+      <w:r>
+        <w:t xml:space="preserve">, we give our React developers a clean, DRY developer experience while keeping the core </w:t>
+      </w:r>
+      <w:r>
+        <w:rPr>
+          <w:rStyle w:val="HTMLCode"/>
+          <w:rFonts w:eastAsiaTheme="majorEastAsia"/>
+        </w:rPr>
+        <w:t>@comp/auth-utility</w:t>
+      </w:r>
+      <w:r>
+        <w:t xml:space="preserve"> perfectly isolated and framework-agnostic.</w:t>
+      </w:r>
+    </w:p>
+    <w:p>
+      <w:pPr>
+        <w:pStyle w:val="Heading3"/>
+      </w:pPr>
+      <w:r>
+        <w:t>The Danger of Framework Coupling</w:t>
+      </w:r>
+      <w:r>
+        <w:t>: Why not just create a hook in auth-utility?</w:t>
+      </w:r>
+    </w:p>
+    <w:p>
+      <w:pPr>
+        <w:pStyle w:val="NormalWeb"/>
+      </w:pPr>
+      <w:r>
+        <w:t xml:space="preserve">Right now, our </w:t>
+      </w:r>
+      <w:r>
+        <w:rPr>
+          <w:rStyle w:val="HTMLCode"/>
+          <w:rFonts w:eastAsiaTheme="majorEastAsia"/>
+        </w:rPr>
+        <w:t>@comp/auth-utility</w:t>
+      </w:r>
+      <w:r>
+        <w:t xml:space="preserve"> is a beautiful, pure vanilla JavaScript module. It only knows about RxJS. It has zero knowledge of React, Vue, or Angular.</w:t>
+      </w:r>
+    </w:p>
+    <w:p>
+      <w:pPr>
+        <w:pStyle w:val="NormalWeb"/>
+      </w:pPr>
+      <w:r>
+        <w:t>If we suddenly put a React Custom Hook (</w:t>
+      </w:r>
+      <w:r>
+        <w:rPr>
+          <w:rStyle w:val="HTMLCode"/>
+          <w:rFonts w:eastAsiaTheme="majorEastAsia"/>
+        </w:rPr>
+        <w:t>useAuth</w:t>
+      </w:r>
+      <w:r>
+        <w:t>) and a React Component (</w:t>
+      </w:r>
+      <w:r>
+        <w:rPr>
+          <w:rStyle w:val="HTMLCode"/>
+          <w:rFonts w:eastAsiaTheme="majorEastAsia"/>
+        </w:rPr>
+        <w:t>&lt;ProtectedRoute&gt;</w:t>
+      </w:r>
+      <w:r>
+        <w:t xml:space="preserve">) inside the Auth Utility, we have to add </w:t>
+      </w:r>
+      <w:r>
+        <w:rPr>
+          <w:rStyle w:val="HTMLCode"/>
+          <w:rFonts w:eastAsiaTheme="majorEastAsia"/>
+        </w:rPr>
+        <w:t>react</w:t>
+      </w:r>
+      <w:r>
+        <w:t xml:space="preserve"> and </w:t>
+      </w:r>
+      <w:r>
+        <w:rPr>
+          <w:rStyle w:val="HTMLCode"/>
+          <w:rFonts w:eastAsiaTheme="majorEastAsia"/>
+        </w:rPr>
+        <w:t>react-dom</w:t>
+      </w:r>
+      <w:r>
+        <w:t xml:space="preserve"> as dependencies to that project.</w:t>
+      </w:r>
+    </w:p>
+    <w:p>
+      <w:pPr>
+        <w:pStyle w:val="NormalWeb"/>
+      </w:pPr>
+      <w:r>
+        <w:t xml:space="preserve">Why is this an enterprise failure? If a different team acquires a Vue.js application and tries to integrate it into our Single-SPA shell, the moment they import the RxJS session stream from </w:t>
+      </w:r>
+      <w:r>
+        <w:rPr>
+          <w:rStyle w:val="HTMLCode"/>
+          <w:rFonts w:eastAsiaTheme="majorEastAsia"/>
+        </w:rPr>
+        <w:t>@comp/auth-utility</w:t>
+      </w:r>
+      <w:r>
+        <w:t>, they will also be forced to download the entire React library into their Vue app just because it happens to live in the same repository.</w:t>
+      </w:r>
+    </w:p>
+    <w:p>
+      <w:pPr>
+        <w:pStyle w:val="Heading3"/>
+      </w:pPr>
+      <w:r>
+        <w:t>The Enterprise-Grade Pattern: The Framework Adapter</w:t>
+      </w:r>
+    </w:p>
+    <w:p>
+      <w:pPr>
+        <w:pStyle w:val="NormalWeb"/>
+      </w:pPr>
+      <w:r>
+        <w:t xml:space="preserve">To keep our architecture highly scalable, we separate </w:t>
+      </w:r>
+      <w:r>
+        <w:rPr>
+          <w:b/>
+          <w:bCs/>
+        </w:rPr>
+        <w:t>Core Logic</w:t>
+      </w:r>
+      <w:r>
+        <w:t xml:space="preserve"> from </w:t>
+      </w:r>
+      <w:r>
+        <w:rPr>
+          <w:b/>
+          <w:bCs/>
+        </w:rPr>
+        <w:t>Framework Implementations</w:t>
+      </w:r>
+      <w:r>
+        <w:t>.</w:t>
+      </w:r>
+    </w:p>
+    <w:p>
+      <w:pPr>
+        <w:pStyle w:val="NormalWeb"/>
+      </w:pPr>
+      <w:r>
+        <w:t xml:space="preserve">Instead of polluting the pure Auth Utility, the enterprise standard is to create a dedicated </w:t>
+      </w:r>
+      <w:r>
+        <w:rPr>
+          <w:b/>
+          <w:bCs/>
+        </w:rPr>
+        <w:t>React Shared Library</w:t>
+      </w:r>
+      <w:r>
+        <w:t xml:space="preserve"> (e.g., </w:t>
+      </w:r>
+      <w:r>
+        <w:rPr>
+          <w:rStyle w:val="HTMLCode"/>
+          <w:rFonts w:eastAsiaTheme="majorEastAsia"/>
+        </w:rPr>
+        <w:t>@comp/react-core</w:t>
+      </w:r>
+      <w:r>
+        <w:t xml:space="preserve"> or </w:t>
+      </w:r>
+      <w:r>
+        <w:rPr>
+          <w:rStyle w:val="HTMLCode"/>
+          <w:rFonts w:eastAsiaTheme="majorEastAsia"/>
+        </w:rPr>
+        <w:t>@comp/shared-ui-logic</w:t>
+      </w:r>
+      <w:r>
+        <w:t>).</w:t>
+      </w:r>
+    </w:p>
+    <w:p>
+      <w:pPr>
+        <w:pStyle w:val="NormalWeb"/>
+      </w:pPr>
+      <w:r>
+        <w:t>Here is how the dependency chain works:</w:t>
+      </w:r>
+    </w:p>
+    <w:p>
+      <w:pPr>
+        <w:pStyle w:val="NormalWeb"/>
+        <w:numPr>
+          <w:ilvl w:val="0"/>
+          <w:numId w:val="17"/>
+        </w:numPr>
+      </w:pPr>
+      <w:r>
+        <w:rPr>
+          <w:rStyle w:val="HTMLCode"/>
+          <w:rFonts w:eastAsiaTheme="majorEastAsia"/>
+          <w:b/>
+          <w:bCs/>
+        </w:rPr>
+        <w:t>@comp/auth-utility</w:t>
+      </w:r>
+      <w:r>
+        <w:rPr>
+          <w:b/>
+          <w:bCs/>
+        </w:rPr>
+        <w:t xml:space="preserve"> (Vanilla JS):</w:t>
+      </w:r>
+      <w:r>
+        <w:t xml:space="preserve"> Continues to manage the raw RxJS stream and network requests.</w:t>
+      </w:r>
+    </w:p>
+    <w:p>
+      <w:pPr>
+        <w:pStyle w:val="NormalWeb"/>
+        <w:numPr>
+          <w:ilvl w:val="0"/>
+          <w:numId w:val="17"/>
+        </w:numPr>
+      </w:pPr>
+      <w:r>
+        <w:rPr>
+          <w:rStyle w:val="HTMLCode"/>
+          <w:rFonts w:eastAsiaTheme="majorEastAsia"/>
+          <w:b/>
+          <w:bCs/>
+        </w:rPr>
+        <w:t>@comp/react-core</w:t>
+      </w:r>
+      <w:r>
+        <w:rPr>
+          <w:b/>
+          <w:bCs/>
+        </w:rPr>
+        <w:t xml:space="preserve"> (React):</w:t>
+      </w:r>
+      <w:r>
+        <w:t xml:space="preserve"> A headless utility module that imports the RxJS stream from </w:t>
+      </w:r>
+      <w:r>
+        <w:rPr>
+          <w:rStyle w:val="HTMLCode"/>
+          <w:rFonts w:eastAsiaTheme="majorEastAsia"/>
+        </w:rPr>
+        <w:t>@comp/auth-utility</w:t>
+      </w:r>
+      <w:r>
+        <w:t xml:space="preserve">, wraps it in the </w:t>
+      </w:r>
+      <w:r>
+        <w:rPr>
+          <w:rStyle w:val="HTMLCode"/>
+          <w:rFonts w:eastAsiaTheme="majorEastAsia"/>
+        </w:rPr>
+        <w:t>useAuth</w:t>
+      </w:r>
+      <w:r>
+        <w:t xml:space="preserve"> hook, builds the </w:t>
+      </w:r>
+      <w:r>
+        <w:rPr>
+          <w:rStyle w:val="HTMLCode"/>
+          <w:rFonts w:eastAsiaTheme="majorEastAsia"/>
+        </w:rPr>
+        <w:t>&lt;ProtectedRoute&gt;</w:t>
+      </w:r>
+      <w:r>
+        <w:t xml:space="preserve"> component, and exports them.</w:t>
+      </w:r>
+    </w:p>
+    <w:p>
+      <w:pPr>
+        <w:pStyle w:val="NormalWeb"/>
+        <w:numPr>
+          <w:ilvl w:val="0"/>
+          <w:numId w:val="17"/>
+        </w:numPr>
+      </w:pPr>
+      <w:r>
+        <w:rPr>
+          <w:b/>
+          <w:bCs/>
+        </w:rPr>
+        <w:lastRenderedPageBreak/>
+        <w:t>Dashboard &amp; Profile MFEs (React):</w:t>
+      </w:r>
+      <w:r>
+        <w:t xml:space="preserve"> Import the ready-to-use hooks and guards directly from </w:t>
+      </w:r>
+      <w:r>
+        <w:rPr>
+          <w:rStyle w:val="HTMLCode"/>
+          <w:rFonts w:eastAsiaTheme="majorEastAsia"/>
+        </w:rPr>
+        <w:t>@</w:t>
+      </w:r>
+      <w:proofErr w:type="gramStart"/>
+      <w:r>
+        <w:rPr>
+          <w:rStyle w:val="HTMLCode"/>
+          <w:rFonts w:eastAsiaTheme="majorEastAsia"/>
+        </w:rPr>
+        <w:t>comp</w:t>
+      </w:r>
+      <w:proofErr w:type="gramEnd"/>
+      <w:r>
+        <w:rPr>
+          <w:rStyle w:val="HTMLCode"/>
+          <w:rFonts w:eastAsiaTheme="majorEastAsia"/>
+        </w:rPr>
+        <w:t>/react-core</w:t>
+      </w:r>
+      <w:r>
+        <w:t>.</w:t>
+      </w:r>
+    </w:p>
+    <w:p>
+      <w:pPr>
+        <w:pStyle w:val="NormalWeb"/>
+      </w:pPr>
+      <w:r>
+        <w:t>By doing this, your React teams get a perfectly tailored, DRY developer experience, while your core Auth Utility remains perfectly isolated and ready to support a Vue or Angular MFE if the business ever pivots.</w:t>
       </w:r>
     </w:p>
     <w:p/>
@@ -19694,6 +19719,119 @@
     </w:lvl>
   </w:abstractNum>
   <w:abstractNum w:abstractNumId="7" w15:restartNumberingAfterBreak="0">
+    <w:nsid w:val="3C2F12A6"/>
+    <w:multiLevelType w:val="multilevel"/>
+    <w:tmpl w:val="58682216"/>
+    <w:lvl w:ilvl="0">
+      <w:start w:val="1"/>
+      <w:numFmt w:val="decimal"/>
+      <w:lvlText w:val="%1."/>
+      <w:lvlJc w:val="left"/>
+      <w:pPr>
+        <w:tabs>
+          <w:tab w:val="num" w:pos="720"/>
+        </w:tabs>
+        <w:ind w:left="720" w:hanging="360"/>
+      </w:pPr>
+    </w:lvl>
+    <w:lvl w:ilvl="1" w:tentative="1">
+      <w:start w:val="1"/>
+      <w:numFmt w:val="decimal"/>
+      <w:lvlText w:val="%2."/>
+      <w:lvlJc w:val="left"/>
+      <w:pPr>
+        <w:tabs>
+          <w:tab w:val="num" w:pos="1440"/>
+        </w:tabs>
+        <w:ind w:left="1440" w:hanging="360"/>
+      </w:pPr>
+    </w:lvl>
+    <w:lvl w:ilvl="2" w:tentative="1">
+      <w:start w:val="1"/>
+      <w:numFmt w:val="decimal"/>
+      <w:lvlText w:val="%3."/>
+      <w:lvlJc w:val="left"/>
+      <w:pPr>
+        <w:tabs>
+          <w:tab w:val="num" w:pos="2160"/>
+        </w:tabs>
+        <w:ind w:left="2160" w:hanging="360"/>
+      </w:pPr>
+    </w:lvl>
+    <w:lvl w:ilvl="3" w:tentative="1">
+      <w:start w:val="1"/>
+      <w:numFmt w:val="decimal"/>
+      <w:lvlText w:val="%4."/>
+      <w:lvlJc w:val="left"/>
+      <w:pPr>
+        <w:tabs>
+          <w:tab w:val="num" w:pos="2880"/>
+        </w:tabs>
+        <w:ind w:left="2880" w:hanging="360"/>
+      </w:pPr>
+    </w:lvl>
+    <w:lvl w:ilvl="4" w:tentative="1">
+      <w:start w:val="1"/>
+      <w:numFmt w:val="decimal"/>
+      <w:lvlText w:val="%5."/>
+      <w:lvlJc w:val="left"/>
+      <w:pPr>
+        <w:tabs>
+          <w:tab w:val="num" w:pos="3600"/>
+        </w:tabs>
+        <w:ind w:left="3600" w:hanging="360"/>
+      </w:pPr>
+    </w:lvl>
+    <w:lvl w:ilvl="5" w:tentative="1">
+      <w:start w:val="1"/>
+      <w:numFmt w:val="decimal"/>
+      <w:lvlText w:val="%6."/>
+      <w:lvlJc w:val="left"/>
+      <w:pPr>
+        <w:tabs>
+          <w:tab w:val="num" w:pos="4320"/>
+        </w:tabs>
+        <w:ind w:left="4320" w:hanging="360"/>
+      </w:pPr>
+    </w:lvl>
+    <w:lvl w:ilvl="6" w:tentative="1">
+      <w:start w:val="1"/>
+      <w:numFmt w:val="decimal"/>
+      <w:lvlText w:val="%7."/>
+      <w:lvlJc w:val="left"/>
+      <w:pPr>
+        <w:tabs>
+          <w:tab w:val="num" w:pos="5040"/>
+        </w:tabs>
+        <w:ind w:left="5040" w:hanging="360"/>
+      </w:pPr>
+    </w:lvl>
+    <w:lvl w:ilvl="7" w:tentative="1">
+      <w:start w:val="1"/>
+      <w:numFmt w:val="decimal"/>
+      <w:lvlText w:val="%8."/>
+      <w:lvlJc w:val="left"/>
+      <w:pPr>
+        <w:tabs>
+          <w:tab w:val="num" w:pos="5760"/>
+        </w:tabs>
+        <w:ind w:left="5760" w:hanging="360"/>
+      </w:pPr>
+    </w:lvl>
+    <w:lvl w:ilvl="8" w:tentative="1">
+      <w:start w:val="1"/>
+      <w:numFmt w:val="decimal"/>
+      <w:lvlText w:val="%9."/>
+      <w:lvlJc w:val="left"/>
+      <w:pPr>
+        <w:tabs>
+          <w:tab w:val="num" w:pos="6480"/>
+        </w:tabs>
+        <w:ind w:left="6480" w:hanging="360"/>
+      </w:pPr>
+    </w:lvl>
+  </w:abstractNum>
+  <w:abstractNum w:abstractNumId="8" w15:restartNumberingAfterBreak="0">
     <w:nsid w:val="3CDD3601"/>
     <w:multiLevelType w:val="multilevel"/>
     <w:tmpl w:val="1450C4F6"/>
@@ -19842,7 +19980,7 @@
       </w:rPr>
     </w:lvl>
   </w:abstractNum>
-  <w:abstractNum w:abstractNumId="8" w15:restartNumberingAfterBreak="0">
+  <w:abstractNum w:abstractNumId="9" w15:restartNumberingAfterBreak="0">
     <w:nsid w:val="4E8E63DB"/>
     <w:multiLevelType w:val="multilevel"/>
     <w:tmpl w:val="44FCCA24"/>
@@ -19955,7 +20093,7 @@
       </w:pPr>
     </w:lvl>
   </w:abstractNum>
-  <w:abstractNum w:abstractNumId="9" w15:restartNumberingAfterBreak="0">
+  <w:abstractNum w:abstractNumId="10" w15:restartNumberingAfterBreak="0">
     <w:nsid w:val="5F8F2B73"/>
     <w:multiLevelType w:val="multilevel"/>
     <w:tmpl w:val="44AC1042"/>
@@ -20068,7 +20206,7 @@
       </w:pPr>
     </w:lvl>
   </w:abstractNum>
-  <w:abstractNum w:abstractNumId="10" w15:restartNumberingAfterBreak="0">
+  <w:abstractNum w:abstractNumId="11" w15:restartNumberingAfterBreak="0">
     <w:nsid w:val="602656A7"/>
     <w:multiLevelType w:val="multilevel"/>
     <w:tmpl w:val="2C6A4F06"/>
@@ -20181,7 +20319,7 @@
       </w:pPr>
     </w:lvl>
   </w:abstractNum>
-  <w:abstractNum w:abstractNumId="11" w15:restartNumberingAfterBreak="0">
+  <w:abstractNum w:abstractNumId="12" w15:restartNumberingAfterBreak="0">
     <w:nsid w:val="635F7476"/>
     <w:multiLevelType w:val="multilevel"/>
     <w:tmpl w:val="5E207A38"/>
@@ -20294,7 +20432,7 @@
       </w:pPr>
     </w:lvl>
   </w:abstractNum>
-  <w:abstractNum w:abstractNumId="12" w15:restartNumberingAfterBreak="0">
+  <w:abstractNum w:abstractNumId="13" w15:restartNumberingAfterBreak="0">
     <w:nsid w:val="6AE516BB"/>
     <w:multiLevelType w:val="multilevel"/>
     <w:tmpl w:val="7F44E612"/>
@@ -20443,7 +20581,7 @@
       </w:rPr>
     </w:lvl>
   </w:abstractNum>
-  <w:abstractNum w:abstractNumId="13" w15:restartNumberingAfterBreak="0">
+  <w:abstractNum w:abstractNumId="14" w15:restartNumberingAfterBreak="0">
     <w:nsid w:val="6D412437"/>
     <w:multiLevelType w:val="multilevel"/>
     <w:tmpl w:val="0B680FC0"/>
@@ -20556,7 +20694,7 @@
       </w:pPr>
     </w:lvl>
   </w:abstractNum>
-  <w:abstractNum w:abstractNumId="14" w15:restartNumberingAfterBreak="0">
+  <w:abstractNum w:abstractNumId="15" w15:restartNumberingAfterBreak="0">
     <w:nsid w:val="71191F06"/>
     <w:multiLevelType w:val="multilevel"/>
     <w:tmpl w:val="A184ABAC"/>
@@ -20669,8 +20807,157 @@
       </w:pPr>
     </w:lvl>
   </w:abstractNum>
+  <w:abstractNum w:abstractNumId="16" w15:restartNumberingAfterBreak="0">
+    <w:nsid w:val="79B91210"/>
+    <w:multiLevelType w:val="multilevel"/>
+    <w:tmpl w:val="20DE5ECC"/>
+    <w:lvl w:ilvl="0">
+      <w:start w:val="1"/>
+      <w:numFmt w:val="bullet"/>
+      <w:lvlText w:val=""/>
+      <w:lvlJc w:val="left"/>
+      <w:pPr>
+        <w:tabs>
+          <w:tab w:val="num" w:pos="720"/>
+        </w:tabs>
+        <w:ind w:left="720" w:hanging="360"/>
+      </w:pPr>
+      <w:rPr>
+        <w:rFonts w:ascii="Symbol" w:hAnsi="Symbol" w:hint="default"/>
+        <w:sz w:val="20"/>
+      </w:rPr>
+    </w:lvl>
+    <w:lvl w:ilvl="1" w:tentative="1">
+      <w:start w:val="1"/>
+      <w:numFmt w:val="bullet"/>
+      <w:lvlText w:val="o"/>
+      <w:lvlJc w:val="left"/>
+      <w:pPr>
+        <w:tabs>
+          <w:tab w:val="num" w:pos="1440"/>
+        </w:tabs>
+        <w:ind w:left="1440" w:hanging="360"/>
+      </w:pPr>
+      <w:rPr>
+        <w:rFonts w:ascii="Courier New" w:hAnsi="Courier New" w:hint="default"/>
+        <w:sz w:val="20"/>
+      </w:rPr>
+    </w:lvl>
+    <w:lvl w:ilvl="2" w:tentative="1">
+      <w:start w:val="1"/>
+      <w:numFmt w:val="bullet"/>
+      <w:lvlText w:val=""/>
+      <w:lvlJc w:val="left"/>
+      <w:pPr>
+        <w:tabs>
+          <w:tab w:val="num" w:pos="2160"/>
+        </w:tabs>
+        <w:ind w:left="2160" w:hanging="360"/>
+      </w:pPr>
+      <w:rPr>
+        <w:rFonts w:ascii="Wingdings" w:hAnsi="Wingdings" w:hint="default"/>
+        <w:sz w:val="20"/>
+      </w:rPr>
+    </w:lvl>
+    <w:lvl w:ilvl="3" w:tentative="1">
+      <w:start w:val="1"/>
+      <w:numFmt w:val="bullet"/>
+      <w:lvlText w:val=""/>
+      <w:lvlJc w:val="left"/>
+      <w:pPr>
+        <w:tabs>
+          <w:tab w:val="num" w:pos="2880"/>
+        </w:tabs>
+        <w:ind w:left="2880" w:hanging="360"/>
+      </w:pPr>
+      <w:rPr>
+        <w:rFonts w:ascii="Wingdings" w:hAnsi="Wingdings" w:hint="default"/>
+        <w:sz w:val="20"/>
+      </w:rPr>
+    </w:lvl>
+    <w:lvl w:ilvl="4" w:tentative="1">
+      <w:start w:val="1"/>
+      <w:numFmt w:val="bullet"/>
+      <w:lvlText w:val=""/>
+      <w:lvlJc w:val="left"/>
+      <w:pPr>
+        <w:tabs>
+          <w:tab w:val="num" w:pos="3600"/>
+        </w:tabs>
+        <w:ind w:left="3600" w:hanging="360"/>
+      </w:pPr>
+      <w:rPr>
+        <w:rFonts w:ascii="Wingdings" w:hAnsi="Wingdings" w:hint="default"/>
+        <w:sz w:val="20"/>
+      </w:rPr>
+    </w:lvl>
+    <w:lvl w:ilvl="5" w:tentative="1">
+      <w:start w:val="1"/>
+      <w:numFmt w:val="bullet"/>
+      <w:lvlText w:val=""/>
+      <w:lvlJc w:val="left"/>
+      <w:pPr>
+        <w:tabs>
+          <w:tab w:val="num" w:pos="4320"/>
+        </w:tabs>
+        <w:ind w:left="4320" w:hanging="360"/>
+      </w:pPr>
+      <w:rPr>
+        <w:rFonts w:ascii="Wingdings" w:hAnsi="Wingdings" w:hint="default"/>
+        <w:sz w:val="20"/>
+      </w:rPr>
+    </w:lvl>
+    <w:lvl w:ilvl="6" w:tentative="1">
+      <w:start w:val="1"/>
+      <w:numFmt w:val="bullet"/>
+      <w:lvlText w:val=""/>
+      <w:lvlJc w:val="left"/>
+      <w:pPr>
+        <w:tabs>
+          <w:tab w:val="num" w:pos="5040"/>
+        </w:tabs>
+        <w:ind w:left="5040" w:hanging="360"/>
+      </w:pPr>
+      <w:rPr>
+        <w:rFonts w:ascii="Wingdings" w:hAnsi="Wingdings" w:hint="default"/>
+        <w:sz w:val="20"/>
+      </w:rPr>
+    </w:lvl>
+    <w:lvl w:ilvl="7" w:tentative="1">
+      <w:start w:val="1"/>
+      <w:numFmt w:val="bullet"/>
+      <w:lvlText w:val=""/>
+      <w:lvlJc w:val="left"/>
+      <w:pPr>
+        <w:tabs>
+          <w:tab w:val="num" w:pos="5760"/>
+        </w:tabs>
+        <w:ind w:left="5760" w:hanging="360"/>
+      </w:pPr>
+      <w:rPr>
+        <w:rFonts w:ascii="Wingdings" w:hAnsi="Wingdings" w:hint="default"/>
+        <w:sz w:val="20"/>
+      </w:rPr>
+    </w:lvl>
+    <w:lvl w:ilvl="8" w:tentative="1">
+      <w:start w:val="1"/>
+      <w:numFmt w:val="bullet"/>
+      <w:lvlText w:val=""/>
+      <w:lvlJc w:val="left"/>
+      <w:pPr>
+        <w:tabs>
+          <w:tab w:val="num" w:pos="6480"/>
+        </w:tabs>
+        <w:ind w:left="6480" w:hanging="360"/>
+      </w:pPr>
+      <w:rPr>
+        <w:rFonts w:ascii="Wingdings" w:hAnsi="Wingdings" w:hint="default"/>
+        <w:sz w:val="20"/>
+      </w:rPr>
+    </w:lvl>
+  </w:abstractNum>
   <w:num w:numId="1" w16cid:durableId="957223053">
-    <w:abstractNumId w:val="8"/>
+    <w:abstractNumId w:val="9"/>
   </w:num>
   <w:num w:numId="2" w16cid:durableId="284318266">
     <w:abstractNumId w:val="1"/>
@@ -20682,37 +20969,43 @@
     <w:abstractNumId w:val="4"/>
   </w:num>
   <w:num w:numId="5" w16cid:durableId="1337615404">
-    <w:abstractNumId w:val="7"/>
+    <w:abstractNumId w:val="8"/>
   </w:num>
   <w:num w:numId="6" w16cid:durableId="1037200046">
-    <w:abstractNumId w:val="14"/>
+    <w:abstractNumId w:val="15"/>
   </w:num>
   <w:num w:numId="7" w16cid:durableId="1011642494">
     <w:abstractNumId w:val="6"/>
   </w:num>
   <w:num w:numId="8" w16cid:durableId="1747074370">
-    <w:abstractNumId w:val="12"/>
+    <w:abstractNumId w:val="13"/>
   </w:num>
   <w:num w:numId="9" w16cid:durableId="1365641112">
-    <w:abstractNumId w:val="13"/>
+    <w:abstractNumId w:val="14"/>
   </w:num>
   <w:num w:numId="10" w16cid:durableId="1790388727">
     <w:abstractNumId w:val="0"/>
   </w:num>
   <w:num w:numId="11" w16cid:durableId="83692830">
-    <w:abstractNumId w:val="10"/>
+    <w:abstractNumId w:val="11"/>
   </w:num>
   <w:num w:numId="12" w16cid:durableId="452985828">
-    <w:abstractNumId w:val="11"/>
+    <w:abstractNumId w:val="12"/>
   </w:num>
   <w:num w:numId="13" w16cid:durableId="2105177445">
-    <w:abstractNumId w:val="9"/>
+    <w:abstractNumId w:val="10"/>
   </w:num>
   <w:num w:numId="14" w16cid:durableId="1414090514">
     <w:abstractNumId w:val="5"/>
   </w:num>
   <w:num w:numId="15" w16cid:durableId="885407061">
     <w:abstractNumId w:val="3"/>
+  </w:num>
+  <w:num w:numId="16" w16cid:durableId="695546100">
+    <w:abstractNumId w:val="16"/>
+  </w:num>
+  <w:num w:numId="17" w16cid:durableId="403645095">
+    <w:abstractNumId w:val="7"/>
   </w:num>
 </w:numbering>
 </file>
@@ -21318,6 +21611,7 @@
   <w:style w:type="character" w:default="1" w:styleId="DefaultParagraphFont">
     <w:name w:val="Default Paragraph Font"/>
     <w:uiPriority w:val="1"/>
+    <w:semiHidden/>
     <w:unhideWhenUsed/>
   </w:style>
   <w:style w:type="table" w:default="1" w:styleId="TableNormal">

</xml_diff>